<commit_message>
refactor: funciones con codigos XTZ, documento consolidado con 4 referencias y limpieza de .md y scripts de prueba
</commit_message>
<xml_diff>
--- a/DOCUMENTACION/PROYECTO_CIFRADO.docx
+++ b/DOCUMENTACION/PROYECTO_CIFRADO.docx
@@ -2761,7 +2761,7 @@
         <w:rPr>
           <w:color w:val="000000" w:themeColor="text1"/>
         </w:rPr>
-        <w:t xml:space="preserve">), escrito en el siglo IX, describió por primera vez el método de análisis de frecuencia. Su observación fue </w:t>
+        <w:t xml:space="preserve">), escrito en el siglo IX, describió por primera vez el método de análisis de frecuencia (referencia consultada a través de Kahn [2] y Singh [3]). Su observación fue </w:t>
       </w:r>
       <w:r>
         <w:rPr>
@@ -3325,7 +3325,7 @@
           <w:rFonts w:ascii="Courier New" w:eastAsia="Courier New" w:hAnsi="Courier New" w:cs="Courier New"/>
           <w:color w:val="000000" w:themeColor="text1"/>
         </w:rPr>
-        <w:t>setAlphabet</w:t>
+        <w:t>x06</w:t>
       </w:r>
       <w:proofErr w:type="spellEnd"/>
       <w:r>
@@ -3486,7 +3486,7 @@
           <w:rFonts w:ascii="Courier New" w:eastAsia="Courier New" w:hAnsi="Courier New" w:cs="Courier New"/>
           <w:color w:val="000000" w:themeColor="text1"/>
         </w:rPr>
-        <w:t>caesarDecrypt</w:t>
+        <w:t>x08</w:t>
       </w:r>
       <w:proofErr w:type="spellEnd"/>
       <w:r>
@@ -3517,7 +3517,7 @@
           <w:rFonts w:ascii="Courier New" w:eastAsia="Courier New" w:hAnsi="Courier New" w:cs="Courier New"/>
           <w:color w:val="000000" w:themeColor="text1"/>
         </w:rPr>
-        <w:t>caesarEncrypt</w:t>
+        <w:t>x07</w:t>
       </w:r>
       <w:proofErr w:type="spellEnd"/>
       <w:r>
@@ -3562,7 +3562,7 @@
           <w:rFonts w:ascii="Courier New" w:eastAsia="Courier New" w:hAnsi="Courier New" w:cs="Courier New"/>
           <w:color w:val="000000" w:themeColor="text1"/>
         </w:rPr>
-        <w:t>normalizeShift</w:t>
+        <w:t>x11</w:t>
       </w:r>
       <w:proofErr w:type="spellEnd"/>
       <w:r>
@@ -3625,39 +3625,25 @@
     <w:tbl>
       <w:tblPr>
         <w:tblStyle w:val="Tablaconcuadrcula"/>
-        <w:tblW w:w="9972" w:type="dxa"/>
-        <w:tblLook w:val="04A0" w:firstRow="1" w:lastRow="0" w:firstColumn="1" w:lastColumn="0" w:noHBand="0" w:noVBand="1"/>
+        <w:tblW w:type="auto" w:w="0"/>
+        <w:tblLook w:firstColumn="1" w:firstRow="1" w:lastColumn="0" w:lastRow="0" w:noHBand="0" w:noVBand="1" w:val="04A0"/>
       </w:tblPr>
       <w:tblGrid>
-        <w:gridCol w:w="2493"/>
-        <w:gridCol w:w="986"/>
-        <w:gridCol w:w="1507"/>
-        <w:gridCol w:w="2493"/>
-        <w:gridCol w:w="811"/>
-        <w:gridCol w:w="1682"/>
+        <w:gridCol w:w="2376"/>
+        <w:gridCol w:w="2376"/>
+        <w:gridCol w:w="2376"/>
+        <w:gridCol w:w="2376"/>
       </w:tblGrid>
       <w:tr>
-        <w:trPr>
-          <w:trHeight w:val="380"/>
-        </w:trPr>
-        <w:tc>
-          <w:tcPr>
-            <w:tcW w:w="2493" w:type="dxa"/>
-          </w:tcPr>
-          <w:p>
-            <w:pPr>
-              <w:spacing w:after="0" w:line="259" w:lineRule="auto"/>
-              <w:ind w:left="115" w:firstLine="0"/>
-              <w:jc w:val="center"/>
-              <w:rPr>
-                <w:color w:val="000000" w:themeColor="text1"/>
-              </w:rPr>
-            </w:pPr>
+        <w:tc>
+          <w:tcPr>
+            <w:tcW w:type="dxa" w:w="2376"/>
+          </w:tcPr>
+          <w:p>
+            <w:r/>
             <w:r>
               <w:rPr>
                 <w:b/>
-                <w:color w:val="000000" w:themeColor="text1"/>
-                <w:sz w:val="18"/>
               </w:rPr>
               <w:t>Original</w:t>
             </w:r>
@@ -3665,37 +3651,13 @@
         </w:tc>
         <w:tc>
           <w:tcPr>
-            <w:tcW w:w="986" w:type="dxa"/>
-          </w:tcPr>
-          <w:p>
-            <w:pPr>
-              <w:spacing w:after="160" w:line="259" w:lineRule="auto"/>
-              <w:ind w:left="0" w:firstLine="0"/>
-              <w:jc w:val="left"/>
-              <w:rPr>
-                <w:color w:val="000000" w:themeColor="text1"/>
-              </w:rPr>
-            </w:pPr>
-          </w:p>
-        </w:tc>
-        <w:tc>
-          <w:tcPr>
-            <w:tcW w:w="1507" w:type="dxa"/>
-          </w:tcPr>
-          <w:p>
-            <w:pPr>
-              <w:spacing w:after="0" w:line="259" w:lineRule="auto"/>
-              <w:ind w:left="0" w:firstLine="0"/>
-              <w:jc w:val="left"/>
-              <w:rPr>
-                <w:color w:val="000000" w:themeColor="text1"/>
-              </w:rPr>
-            </w:pPr>
+            <w:tcW w:type="dxa" w:w="2376"/>
+          </w:tcPr>
+          <w:p>
+            <w:r/>
             <w:r>
               <w:rPr>
                 <w:b/>
-                <w:color w:val="000000" w:themeColor="text1"/>
-                <w:sz w:val="18"/>
               </w:rPr>
               <w:t>Índice</w:t>
             </w:r>
@@ -3703,22 +3665,13 @@
         </w:tc>
         <w:tc>
           <w:tcPr>
-            <w:tcW w:w="2493" w:type="dxa"/>
-          </w:tcPr>
-          <w:p>
-            <w:pPr>
-              <w:spacing w:after="0" w:line="259" w:lineRule="auto"/>
-              <w:ind w:left="115" w:firstLine="0"/>
-              <w:jc w:val="center"/>
-              <w:rPr>
-                <w:color w:val="000000" w:themeColor="text1"/>
-              </w:rPr>
-            </w:pPr>
+            <w:tcW w:type="dxa" w:w="2376"/>
+          </w:tcPr>
+          <w:p>
+            <w:r/>
             <w:r>
               <w:rPr>
                 <w:b/>
-                <w:color w:val="000000" w:themeColor="text1"/>
-                <w:sz w:val="18"/>
               </w:rPr>
               <w:t>Cálculo</w:t>
             </w:r>
@@ -3726,37 +3679,13 @@
         </w:tc>
         <w:tc>
           <w:tcPr>
-            <w:tcW w:w="811" w:type="dxa"/>
-          </w:tcPr>
-          <w:p>
-            <w:pPr>
-              <w:spacing w:after="160" w:line="259" w:lineRule="auto"/>
-              <w:ind w:left="0" w:firstLine="0"/>
-              <w:jc w:val="left"/>
-              <w:rPr>
-                <w:color w:val="000000" w:themeColor="text1"/>
-              </w:rPr>
-            </w:pPr>
-          </w:p>
-        </w:tc>
-        <w:tc>
-          <w:tcPr>
-            <w:tcW w:w="1682" w:type="dxa"/>
-          </w:tcPr>
-          <w:p>
-            <w:pPr>
-              <w:spacing w:after="0" w:line="259" w:lineRule="auto"/>
-              <w:ind w:left="0" w:firstLine="0"/>
-              <w:jc w:val="left"/>
-              <w:rPr>
-                <w:color w:val="000000" w:themeColor="text1"/>
-              </w:rPr>
-            </w:pPr>
+            <w:tcW w:type="dxa" w:w="2376"/>
+          </w:tcPr>
+          <w:p>
+            <w:r/>
             <w:r>
               <w:rPr>
                 <w:b/>
-                <w:color w:val="000000" w:themeColor="text1"/>
-                <w:sz w:val="18"/>
               </w:rPr>
               <w:t>Resultado</w:t>
             </w:r>
@@ -3764,617 +3693,232 @@
         </w:tc>
       </w:tr>
       <w:tr>
-        <w:trPr>
-          <w:trHeight w:val="380"/>
-        </w:trPr>
-        <w:tc>
-          <w:tcPr>
-            <w:tcW w:w="2493" w:type="dxa"/>
-          </w:tcPr>
-          <w:p>
-            <w:pPr>
-              <w:spacing w:after="0" w:line="259" w:lineRule="auto"/>
-              <w:ind w:left="100" w:firstLine="0"/>
-              <w:jc w:val="left"/>
-              <w:rPr>
-                <w:color w:val="000000" w:themeColor="text1"/>
-              </w:rPr>
-            </w:pPr>
-            <w:r>
-              <w:rPr>
-                <w:color w:val="000000" w:themeColor="text1"/>
-                <w:sz w:val="17"/>
-              </w:rPr>
+        <w:tc>
+          <w:tcPr>
+            <w:tcW w:type="dxa" w:w="2376"/>
+          </w:tcPr>
+          <w:p>
+            <w:r/>
+            <w:r>
               <w:t>a</w:t>
             </w:r>
           </w:p>
         </w:tc>
         <w:tc>
           <w:tcPr>
-            <w:tcW w:w="986" w:type="dxa"/>
-          </w:tcPr>
-          <w:p>
-            <w:pPr>
-              <w:spacing w:after="0" w:line="259" w:lineRule="auto"/>
-              <w:ind w:left="100" w:firstLine="0"/>
-              <w:jc w:val="left"/>
-              <w:rPr>
-                <w:color w:val="000000" w:themeColor="text1"/>
-              </w:rPr>
-            </w:pPr>
-            <w:r>
-              <w:rPr>
-                <w:color w:val="000000" w:themeColor="text1"/>
-                <w:sz w:val="17"/>
-              </w:rPr>
+            <w:tcW w:type="dxa" w:w="2376"/>
+          </w:tcPr>
+          <w:p>
+            <w:r/>
+            <w:r>
               <w:t>0</w:t>
             </w:r>
           </w:p>
         </w:tc>
         <w:tc>
           <w:tcPr>
-            <w:tcW w:w="1507" w:type="dxa"/>
-          </w:tcPr>
-          <w:p>
-            <w:pPr>
-              <w:spacing w:after="160" w:line="259" w:lineRule="auto"/>
-              <w:ind w:left="0" w:firstLine="0"/>
-              <w:jc w:val="left"/>
-              <w:rPr>
-                <w:color w:val="000000" w:themeColor="text1"/>
-              </w:rPr>
-            </w:pPr>
-          </w:p>
-        </w:tc>
-        <w:tc>
-          <w:tcPr>
-            <w:tcW w:w="2493" w:type="dxa"/>
-          </w:tcPr>
-          <w:p>
-            <w:pPr>
-              <w:spacing w:after="0" w:line="259" w:lineRule="auto"/>
-              <w:ind w:left="100" w:firstLine="0"/>
-              <w:jc w:val="left"/>
-              <w:rPr>
-                <w:color w:val="000000" w:themeColor="text1"/>
-              </w:rPr>
-            </w:pPr>
-            <w:r>
-              <w:rPr>
-                <w:color w:val="000000" w:themeColor="text1"/>
-                <w:sz w:val="17"/>
-              </w:rPr>
+            <w:tcW w:type="dxa" w:w="2376"/>
+          </w:tcPr>
+          <w:p>
+            <w:r/>
+            <w:r>
               <w:t>(0+2) mod 5 = 2</w:t>
             </w:r>
           </w:p>
         </w:tc>
         <w:tc>
           <w:tcPr>
-            <w:tcW w:w="811" w:type="dxa"/>
-          </w:tcPr>
-          <w:p>
-            <w:pPr>
-              <w:spacing w:after="0" w:line="259" w:lineRule="auto"/>
-              <w:ind w:left="100" w:firstLine="0"/>
-              <w:jc w:val="left"/>
-              <w:rPr>
-                <w:color w:val="000000" w:themeColor="text1"/>
-              </w:rPr>
-            </w:pPr>
-            <w:r>
-              <w:rPr>
-                <w:color w:val="000000" w:themeColor="text1"/>
-                <w:sz w:val="17"/>
-              </w:rPr>
+            <w:tcW w:type="dxa" w:w="2376"/>
+          </w:tcPr>
+          <w:p>
+            <w:r/>
+            <w:r>
               <w:t>c</w:t>
             </w:r>
-          </w:p>
-        </w:tc>
-        <w:tc>
-          <w:tcPr>
-            <w:tcW w:w="1682" w:type="dxa"/>
-          </w:tcPr>
-          <w:p>
-            <w:pPr>
-              <w:spacing w:after="160" w:line="259" w:lineRule="auto"/>
-              <w:ind w:left="0" w:firstLine="0"/>
-              <w:jc w:val="left"/>
-              <w:rPr>
-                <w:color w:val="000000" w:themeColor="text1"/>
-              </w:rPr>
-            </w:pPr>
           </w:p>
         </w:tc>
       </w:tr>
       <w:tr>
-        <w:trPr>
-          <w:trHeight w:val="380"/>
-        </w:trPr>
-        <w:tc>
-          <w:tcPr>
-            <w:tcW w:w="2493" w:type="dxa"/>
-          </w:tcPr>
-          <w:p>
-            <w:pPr>
-              <w:spacing w:after="0" w:line="259" w:lineRule="auto"/>
-              <w:ind w:left="100" w:firstLine="0"/>
-              <w:jc w:val="left"/>
-              <w:rPr>
-                <w:color w:val="000000" w:themeColor="text1"/>
-              </w:rPr>
-            </w:pPr>
-            <w:r>
-              <w:rPr>
-                <w:color w:val="000000" w:themeColor="text1"/>
-                <w:sz w:val="17"/>
-              </w:rPr>
+        <w:tc>
+          <w:tcPr>
+            <w:tcW w:type="dxa" w:w="2376"/>
+          </w:tcPr>
+          <w:p>
+            <w:r/>
+            <w:r>
               <w:t>b</w:t>
             </w:r>
           </w:p>
         </w:tc>
         <w:tc>
           <w:tcPr>
-            <w:tcW w:w="986" w:type="dxa"/>
-          </w:tcPr>
-          <w:p>
-            <w:pPr>
-              <w:spacing w:after="0" w:line="259" w:lineRule="auto"/>
-              <w:ind w:left="100" w:firstLine="0"/>
-              <w:jc w:val="left"/>
-              <w:rPr>
-                <w:color w:val="000000" w:themeColor="text1"/>
-              </w:rPr>
-            </w:pPr>
-            <w:r>
-              <w:rPr>
-                <w:color w:val="000000" w:themeColor="text1"/>
-                <w:sz w:val="17"/>
-              </w:rPr>
+            <w:tcW w:type="dxa" w:w="2376"/>
+          </w:tcPr>
+          <w:p>
+            <w:r/>
+            <w:r>
               <w:t>1</w:t>
             </w:r>
           </w:p>
         </w:tc>
         <w:tc>
           <w:tcPr>
-            <w:tcW w:w="1507" w:type="dxa"/>
-          </w:tcPr>
-          <w:p>
-            <w:pPr>
-              <w:spacing w:after="160" w:line="259" w:lineRule="auto"/>
-              <w:ind w:left="0" w:firstLine="0"/>
-              <w:jc w:val="left"/>
-              <w:rPr>
-                <w:color w:val="000000" w:themeColor="text1"/>
-              </w:rPr>
-            </w:pPr>
-          </w:p>
-        </w:tc>
-        <w:tc>
-          <w:tcPr>
-            <w:tcW w:w="2493" w:type="dxa"/>
-          </w:tcPr>
-          <w:p>
-            <w:pPr>
-              <w:spacing w:after="0" w:line="259" w:lineRule="auto"/>
-              <w:ind w:left="100" w:firstLine="0"/>
-              <w:jc w:val="left"/>
-              <w:rPr>
-                <w:color w:val="000000" w:themeColor="text1"/>
-              </w:rPr>
-            </w:pPr>
-            <w:r>
-              <w:rPr>
-                <w:color w:val="000000" w:themeColor="text1"/>
-                <w:sz w:val="17"/>
-              </w:rPr>
+            <w:tcW w:type="dxa" w:w="2376"/>
+          </w:tcPr>
+          <w:p>
+            <w:r/>
+            <w:r>
               <w:t>(1+2) mod 5 = 3</w:t>
             </w:r>
           </w:p>
         </w:tc>
         <w:tc>
           <w:tcPr>
-            <w:tcW w:w="811" w:type="dxa"/>
-          </w:tcPr>
-          <w:p>
-            <w:pPr>
-              <w:spacing w:after="0" w:line="259" w:lineRule="auto"/>
-              <w:ind w:left="100" w:firstLine="0"/>
-              <w:jc w:val="left"/>
-              <w:rPr>
-                <w:color w:val="000000" w:themeColor="text1"/>
-              </w:rPr>
-            </w:pPr>
-            <w:r>
-              <w:rPr>
-                <w:color w:val="000000" w:themeColor="text1"/>
-                <w:sz w:val="17"/>
-              </w:rPr>
+            <w:tcW w:type="dxa" w:w="2376"/>
+          </w:tcPr>
+          <w:p>
+            <w:r/>
+            <w:r>
               <w:t>d</w:t>
             </w:r>
-          </w:p>
-        </w:tc>
-        <w:tc>
-          <w:tcPr>
-            <w:tcW w:w="1682" w:type="dxa"/>
-          </w:tcPr>
-          <w:p>
-            <w:pPr>
-              <w:spacing w:after="160" w:line="259" w:lineRule="auto"/>
-              <w:ind w:left="0" w:firstLine="0"/>
-              <w:jc w:val="left"/>
-              <w:rPr>
-                <w:color w:val="000000" w:themeColor="text1"/>
-              </w:rPr>
-            </w:pPr>
           </w:p>
         </w:tc>
       </w:tr>
       <w:tr>
-        <w:trPr>
-          <w:trHeight w:val="380"/>
-        </w:trPr>
-        <w:tc>
-          <w:tcPr>
-            <w:tcW w:w="2493" w:type="dxa"/>
-          </w:tcPr>
-          <w:p>
-            <w:pPr>
-              <w:spacing w:after="0" w:line="259" w:lineRule="auto"/>
-              <w:ind w:left="100" w:firstLine="0"/>
-              <w:jc w:val="left"/>
-              <w:rPr>
-                <w:color w:val="000000" w:themeColor="text1"/>
-              </w:rPr>
-            </w:pPr>
-            <w:r>
-              <w:rPr>
-                <w:color w:val="000000" w:themeColor="text1"/>
-                <w:sz w:val="17"/>
-              </w:rPr>
+        <w:tc>
+          <w:tcPr>
+            <w:tcW w:type="dxa" w:w="2376"/>
+          </w:tcPr>
+          <w:p>
+            <w:r/>
+            <w:r>
               <w:t>c</w:t>
             </w:r>
           </w:p>
         </w:tc>
         <w:tc>
           <w:tcPr>
-            <w:tcW w:w="986" w:type="dxa"/>
-          </w:tcPr>
-          <w:p>
-            <w:pPr>
-              <w:spacing w:after="0" w:line="259" w:lineRule="auto"/>
-              <w:ind w:left="100" w:firstLine="0"/>
-              <w:jc w:val="left"/>
-              <w:rPr>
-                <w:color w:val="000000" w:themeColor="text1"/>
-              </w:rPr>
-            </w:pPr>
-            <w:r>
-              <w:rPr>
-                <w:color w:val="000000" w:themeColor="text1"/>
-                <w:sz w:val="17"/>
-              </w:rPr>
+            <w:tcW w:type="dxa" w:w="2376"/>
+          </w:tcPr>
+          <w:p>
+            <w:r/>
+            <w:r>
               <w:t>2</w:t>
             </w:r>
           </w:p>
         </w:tc>
         <w:tc>
           <w:tcPr>
-            <w:tcW w:w="1507" w:type="dxa"/>
-          </w:tcPr>
-          <w:p>
-            <w:pPr>
-              <w:spacing w:after="160" w:line="259" w:lineRule="auto"/>
-              <w:ind w:left="0" w:firstLine="0"/>
-              <w:jc w:val="left"/>
-              <w:rPr>
-                <w:color w:val="000000" w:themeColor="text1"/>
-              </w:rPr>
-            </w:pPr>
-          </w:p>
-        </w:tc>
-        <w:tc>
-          <w:tcPr>
-            <w:tcW w:w="2493" w:type="dxa"/>
-          </w:tcPr>
-          <w:p>
-            <w:pPr>
-              <w:spacing w:after="0" w:line="259" w:lineRule="auto"/>
-              <w:ind w:left="100" w:firstLine="0"/>
-              <w:jc w:val="left"/>
-              <w:rPr>
-                <w:color w:val="000000" w:themeColor="text1"/>
-              </w:rPr>
-            </w:pPr>
-            <w:r>
-              <w:rPr>
-                <w:color w:val="000000" w:themeColor="text1"/>
-                <w:sz w:val="17"/>
-              </w:rPr>
+            <w:tcW w:type="dxa" w:w="2376"/>
+          </w:tcPr>
+          <w:p>
+            <w:r/>
+            <w:r>
               <w:t>(2+2) mod 5 = 4</w:t>
             </w:r>
           </w:p>
         </w:tc>
         <w:tc>
           <w:tcPr>
-            <w:tcW w:w="811" w:type="dxa"/>
-          </w:tcPr>
-          <w:p>
-            <w:pPr>
-              <w:spacing w:after="0" w:line="259" w:lineRule="auto"/>
-              <w:ind w:left="100" w:firstLine="0"/>
-              <w:jc w:val="left"/>
-              <w:rPr>
-                <w:color w:val="000000" w:themeColor="text1"/>
-              </w:rPr>
-            </w:pPr>
-            <w:r>
-              <w:rPr>
-                <w:color w:val="000000" w:themeColor="text1"/>
-                <w:sz w:val="17"/>
-              </w:rPr>
+            <w:tcW w:type="dxa" w:w="2376"/>
+          </w:tcPr>
+          <w:p>
+            <w:r/>
+            <w:r>
               <w:t>e</w:t>
             </w:r>
-          </w:p>
-        </w:tc>
-        <w:tc>
-          <w:tcPr>
-            <w:tcW w:w="1682" w:type="dxa"/>
-          </w:tcPr>
-          <w:p>
-            <w:pPr>
-              <w:spacing w:after="160" w:line="259" w:lineRule="auto"/>
-              <w:ind w:left="0" w:firstLine="0"/>
-              <w:jc w:val="left"/>
-              <w:rPr>
-                <w:color w:val="000000" w:themeColor="text1"/>
-              </w:rPr>
-            </w:pPr>
           </w:p>
         </w:tc>
       </w:tr>
       <w:tr>
-        <w:trPr>
-          <w:trHeight w:val="380"/>
-        </w:trPr>
-        <w:tc>
-          <w:tcPr>
-            <w:tcW w:w="2493" w:type="dxa"/>
-          </w:tcPr>
-          <w:p>
-            <w:pPr>
-              <w:spacing w:after="0" w:line="259" w:lineRule="auto"/>
-              <w:ind w:left="100" w:firstLine="0"/>
-              <w:jc w:val="left"/>
-              <w:rPr>
-                <w:color w:val="000000" w:themeColor="text1"/>
-              </w:rPr>
-            </w:pPr>
-            <w:r>
-              <w:rPr>
-                <w:color w:val="000000" w:themeColor="text1"/>
-                <w:sz w:val="17"/>
-              </w:rPr>
+        <w:tc>
+          <w:tcPr>
+            <w:tcW w:type="dxa" w:w="2376"/>
+          </w:tcPr>
+          <w:p>
+            <w:r/>
+            <w:r>
               <w:t>d</w:t>
             </w:r>
           </w:p>
         </w:tc>
         <w:tc>
           <w:tcPr>
-            <w:tcW w:w="986" w:type="dxa"/>
-          </w:tcPr>
-          <w:p>
-            <w:pPr>
-              <w:spacing w:after="0" w:line="259" w:lineRule="auto"/>
-              <w:ind w:left="100" w:firstLine="0"/>
-              <w:jc w:val="left"/>
-              <w:rPr>
-                <w:color w:val="000000" w:themeColor="text1"/>
-              </w:rPr>
-            </w:pPr>
-            <w:r>
-              <w:rPr>
-                <w:color w:val="000000" w:themeColor="text1"/>
-                <w:sz w:val="17"/>
-              </w:rPr>
+            <w:tcW w:type="dxa" w:w="2376"/>
+          </w:tcPr>
+          <w:p>
+            <w:r/>
+            <w:r>
               <w:t>3</w:t>
             </w:r>
           </w:p>
         </w:tc>
         <w:tc>
           <w:tcPr>
-            <w:tcW w:w="1507" w:type="dxa"/>
-          </w:tcPr>
-          <w:p>
-            <w:pPr>
-              <w:spacing w:after="160" w:line="259" w:lineRule="auto"/>
-              <w:ind w:left="0" w:firstLine="0"/>
-              <w:jc w:val="left"/>
-              <w:rPr>
-                <w:color w:val="000000" w:themeColor="text1"/>
-              </w:rPr>
-            </w:pPr>
-          </w:p>
-        </w:tc>
-        <w:tc>
-          <w:tcPr>
-            <w:tcW w:w="2493" w:type="dxa"/>
-          </w:tcPr>
-          <w:p>
-            <w:pPr>
-              <w:spacing w:after="0" w:line="259" w:lineRule="auto"/>
-              <w:ind w:left="100" w:firstLine="0"/>
-              <w:jc w:val="left"/>
-              <w:rPr>
-                <w:color w:val="000000" w:themeColor="text1"/>
-              </w:rPr>
-            </w:pPr>
-            <w:r>
-              <w:rPr>
-                <w:color w:val="000000" w:themeColor="text1"/>
-                <w:sz w:val="17"/>
-              </w:rPr>
+            <w:tcW w:type="dxa" w:w="2376"/>
+          </w:tcPr>
+          <w:p>
+            <w:r/>
+            <w:r>
               <w:t>(3+2) mod 5 = 0</w:t>
             </w:r>
           </w:p>
         </w:tc>
         <w:tc>
           <w:tcPr>
-            <w:tcW w:w="811" w:type="dxa"/>
-          </w:tcPr>
-          <w:p>
-            <w:pPr>
-              <w:spacing w:after="0" w:line="259" w:lineRule="auto"/>
-              <w:ind w:left="100" w:firstLine="0"/>
-              <w:jc w:val="left"/>
-              <w:rPr>
-                <w:color w:val="000000" w:themeColor="text1"/>
-              </w:rPr>
-            </w:pPr>
-            <w:r>
-              <w:rPr>
-                <w:color w:val="000000" w:themeColor="text1"/>
-                <w:sz w:val="17"/>
-              </w:rPr>
+            <w:tcW w:type="dxa" w:w="2376"/>
+          </w:tcPr>
+          <w:p>
+            <w:r/>
+            <w:r>
               <w:t>a</w:t>
             </w:r>
-          </w:p>
-        </w:tc>
-        <w:tc>
-          <w:tcPr>
-            <w:tcW w:w="1682" w:type="dxa"/>
-          </w:tcPr>
-          <w:p>
-            <w:pPr>
-              <w:spacing w:after="160" w:line="259" w:lineRule="auto"/>
-              <w:ind w:left="0" w:firstLine="0"/>
-              <w:jc w:val="left"/>
-              <w:rPr>
-                <w:color w:val="000000" w:themeColor="text1"/>
-              </w:rPr>
-            </w:pPr>
           </w:p>
         </w:tc>
       </w:tr>
       <w:tr>
-        <w:trPr>
-          <w:trHeight w:val="380"/>
-        </w:trPr>
-        <w:tc>
-          <w:tcPr>
-            <w:tcW w:w="2493" w:type="dxa"/>
-          </w:tcPr>
-          <w:p>
-            <w:pPr>
-              <w:spacing w:after="0" w:line="259" w:lineRule="auto"/>
-              <w:ind w:left="100" w:firstLine="0"/>
-              <w:jc w:val="left"/>
-              <w:rPr>
-                <w:color w:val="000000" w:themeColor="text1"/>
-              </w:rPr>
-            </w:pPr>
-            <w:r>
-              <w:rPr>
-                <w:color w:val="000000" w:themeColor="text1"/>
-                <w:sz w:val="17"/>
-              </w:rPr>
+        <w:tc>
+          <w:tcPr>
+            <w:tcW w:type="dxa" w:w="2376"/>
+          </w:tcPr>
+          <w:p>
+            <w:r/>
+            <w:r>
               <w:t>e</w:t>
             </w:r>
           </w:p>
         </w:tc>
         <w:tc>
           <w:tcPr>
-            <w:tcW w:w="986" w:type="dxa"/>
-          </w:tcPr>
-          <w:p>
-            <w:pPr>
-              <w:spacing w:after="0" w:line="259" w:lineRule="auto"/>
-              <w:ind w:left="100" w:firstLine="0"/>
-              <w:jc w:val="left"/>
-              <w:rPr>
-                <w:color w:val="000000" w:themeColor="text1"/>
-              </w:rPr>
-            </w:pPr>
-            <w:r>
-              <w:rPr>
-                <w:color w:val="000000" w:themeColor="text1"/>
-                <w:sz w:val="17"/>
-              </w:rPr>
+            <w:tcW w:type="dxa" w:w="2376"/>
+          </w:tcPr>
+          <w:p>
+            <w:r/>
+            <w:r>
               <w:t>4</w:t>
             </w:r>
           </w:p>
         </w:tc>
         <w:tc>
           <w:tcPr>
-            <w:tcW w:w="1507" w:type="dxa"/>
-          </w:tcPr>
-          <w:p>
-            <w:pPr>
-              <w:spacing w:after="160" w:line="259" w:lineRule="auto"/>
-              <w:ind w:left="0" w:firstLine="0"/>
-              <w:jc w:val="left"/>
-              <w:rPr>
-                <w:color w:val="000000" w:themeColor="text1"/>
-              </w:rPr>
-            </w:pPr>
-          </w:p>
-        </w:tc>
-        <w:tc>
-          <w:tcPr>
-            <w:tcW w:w="2493" w:type="dxa"/>
-          </w:tcPr>
-          <w:p>
-            <w:pPr>
-              <w:spacing w:after="0" w:line="259" w:lineRule="auto"/>
-              <w:ind w:left="100" w:firstLine="0"/>
-              <w:jc w:val="left"/>
-              <w:rPr>
-                <w:color w:val="000000" w:themeColor="text1"/>
-              </w:rPr>
-            </w:pPr>
-            <w:r>
-              <w:rPr>
-                <w:color w:val="000000" w:themeColor="text1"/>
-                <w:sz w:val="17"/>
-              </w:rPr>
+            <w:tcW w:type="dxa" w:w="2376"/>
+          </w:tcPr>
+          <w:p>
+            <w:r/>
+            <w:r>
               <w:t>(4+2) mod 5 = 1</w:t>
             </w:r>
           </w:p>
         </w:tc>
         <w:tc>
           <w:tcPr>
-            <w:tcW w:w="811" w:type="dxa"/>
-          </w:tcPr>
-          <w:p>
-            <w:pPr>
-              <w:spacing w:after="0" w:line="259" w:lineRule="auto"/>
-              <w:ind w:left="100" w:firstLine="0"/>
-              <w:jc w:val="left"/>
-              <w:rPr>
-                <w:color w:val="000000" w:themeColor="text1"/>
-              </w:rPr>
-            </w:pPr>
-            <w:r>
-              <w:rPr>
-                <w:color w:val="000000" w:themeColor="text1"/>
-                <w:sz w:val="17"/>
-              </w:rPr>
+            <w:tcW w:type="dxa" w:w="2376"/>
+          </w:tcPr>
+          <w:p>
+            <w:r/>
+            <w:r>
               <w:t>b</w:t>
             </w:r>
-          </w:p>
-        </w:tc>
-        <w:tc>
-          <w:tcPr>
-            <w:tcW w:w="1682" w:type="dxa"/>
-          </w:tcPr>
-          <w:p>
-            <w:pPr>
-              <w:spacing w:after="160" w:line="259" w:lineRule="auto"/>
-              <w:ind w:left="0" w:firstLine="0"/>
-              <w:jc w:val="left"/>
-              <w:rPr>
-                <w:color w:val="000000" w:themeColor="text1"/>
-              </w:rPr>
-            </w:pPr>
           </w:p>
         </w:tc>
       </w:tr>
@@ -4517,7 +4061,7 @@
           <w:rFonts w:ascii="Courier New" w:eastAsia="Courier New" w:hAnsi="Courier New" w:cs="Courier New"/>
           <w:color w:val="000000" w:themeColor="text1"/>
         </w:rPr>
-        <w:t>atbashEncrypt</w:t>
+        <w:t>x09</w:t>
       </w:r>
       <w:proofErr w:type="spellEnd"/>
       <w:r>
@@ -4548,7 +4092,7 @@
           <w:rFonts w:ascii="Courier New" w:eastAsia="Courier New" w:hAnsi="Courier New" w:cs="Courier New"/>
           <w:color w:val="000000" w:themeColor="text1"/>
         </w:rPr>
-        <w:t>atbashDecrypt</w:t>
+        <w:t>x09i</w:t>
       </w:r>
       <w:proofErr w:type="spellEnd"/>
       <w:r>
@@ -4570,7 +4114,7 @@
         <w:rPr>
           <w:color w:val="000000" w:themeColor="text1"/>
         </w:rPr>
-        <w:t xml:space="preserve"> son la misma función.</w:t>
+        <w:t xml:space="preserve"> comparten la misma lógica de inversión.</w:t>
       </w:r>
     </w:p>
     <w:p>
@@ -4612,79 +4156,39 @@
     <w:tbl>
       <w:tblPr>
         <w:tblStyle w:val="Tablaconcuadrcula"/>
-        <w:tblW w:w="9972" w:type="dxa"/>
-        <w:tblLook w:val="04A0" w:firstRow="1" w:lastRow="0" w:firstColumn="1" w:lastColumn="0" w:noHBand="0" w:noVBand="1"/>
+        <w:tblW w:type="auto" w:w="0"/>
+        <w:tblLook w:firstColumn="1" w:firstRow="1" w:lastColumn="0" w:lastRow="0" w:noHBand="0" w:noVBand="1" w:val="04A0"/>
       </w:tblPr>
       <w:tblGrid>
-        <w:gridCol w:w="2493"/>
-        <w:gridCol w:w="986"/>
-        <w:gridCol w:w="1507"/>
-        <w:gridCol w:w="921"/>
-        <w:gridCol w:w="1572"/>
-        <w:gridCol w:w="811"/>
-        <w:gridCol w:w="1682"/>
+        <w:gridCol w:w="2376"/>
+        <w:gridCol w:w="2376"/>
+        <w:gridCol w:w="2376"/>
+        <w:gridCol w:w="2376"/>
       </w:tblGrid>
       <w:tr>
-        <w:trPr>
-          <w:trHeight w:val="380"/>
-        </w:trPr>
-        <w:tc>
-          <w:tcPr>
-            <w:tcW w:w="2493" w:type="dxa"/>
-          </w:tcPr>
-          <w:p>
-            <w:pPr>
-              <w:spacing w:after="0" w:line="259" w:lineRule="auto"/>
-              <w:ind w:left="115" w:firstLine="0"/>
-              <w:jc w:val="center"/>
-              <w:rPr>
-                <w:color w:val="000000" w:themeColor="text1"/>
-              </w:rPr>
-            </w:pPr>
+        <w:tc>
+          <w:tcPr>
+            <w:tcW w:type="dxa" w:w="2376"/>
+          </w:tcPr>
+          <w:p>
+            <w:r/>
             <w:r>
               <w:rPr>
                 <w:b/>
-                <w:color w:val="000000" w:themeColor="text1"/>
-                <w:sz w:val="18"/>
-              </w:rPr>
-              <w:lastRenderedPageBreak/>
+              </w:rPr>
               <w:t>Original</w:t>
             </w:r>
           </w:p>
         </w:tc>
         <w:tc>
           <w:tcPr>
-            <w:tcW w:w="986" w:type="dxa"/>
-          </w:tcPr>
-          <w:p>
-            <w:pPr>
-              <w:spacing w:after="160" w:line="259" w:lineRule="auto"/>
-              <w:ind w:left="0" w:firstLine="0"/>
-              <w:jc w:val="left"/>
-              <w:rPr>
-                <w:color w:val="000000" w:themeColor="text1"/>
-              </w:rPr>
-            </w:pPr>
-          </w:p>
-        </w:tc>
-        <w:tc>
-          <w:tcPr>
-            <w:tcW w:w="1507" w:type="dxa"/>
-          </w:tcPr>
-          <w:p>
-            <w:pPr>
-              <w:spacing w:after="0" w:line="259" w:lineRule="auto"/>
-              <w:ind w:left="0" w:firstLine="0"/>
-              <w:jc w:val="left"/>
-              <w:rPr>
-                <w:color w:val="000000" w:themeColor="text1"/>
-              </w:rPr>
-            </w:pPr>
+            <w:tcW w:type="dxa" w:w="2376"/>
+          </w:tcPr>
+          <w:p>
+            <w:r/>
             <w:r>
               <w:rPr>
                 <w:b/>
-                <w:color w:val="000000" w:themeColor="text1"/>
-                <w:sz w:val="18"/>
               </w:rPr>
               <w:t>Índice</w:t>
             </w:r>
@@ -4692,37 +4196,13 @@
         </w:tc>
         <w:tc>
           <w:tcPr>
-            <w:tcW w:w="921" w:type="dxa"/>
-          </w:tcPr>
-          <w:p>
-            <w:pPr>
-              <w:spacing w:after="160" w:line="259" w:lineRule="auto"/>
-              <w:ind w:left="0" w:firstLine="0"/>
-              <w:jc w:val="left"/>
-              <w:rPr>
-                <w:color w:val="000000" w:themeColor="text1"/>
-              </w:rPr>
-            </w:pPr>
-          </w:p>
-        </w:tc>
-        <w:tc>
-          <w:tcPr>
-            <w:tcW w:w="1572" w:type="dxa"/>
-          </w:tcPr>
-          <w:p>
-            <w:pPr>
-              <w:spacing w:after="0" w:line="259" w:lineRule="auto"/>
-              <w:ind w:left="0" w:firstLine="0"/>
-              <w:jc w:val="left"/>
-              <w:rPr>
-                <w:color w:val="000000" w:themeColor="text1"/>
-              </w:rPr>
-            </w:pPr>
+            <w:tcW w:type="dxa" w:w="2376"/>
+          </w:tcPr>
+          <w:p>
+            <w:r/>
             <w:r>
               <w:rPr>
                 <w:b/>
-                <w:color w:val="000000" w:themeColor="text1"/>
-                <w:sz w:val="18"/>
               </w:rPr>
               <w:t>Cálculo</w:t>
             </w:r>
@@ -4730,37 +4210,13 @@
         </w:tc>
         <w:tc>
           <w:tcPr>
-            <w:tcW w:w="811" w:type="dxa"/>
-          </w:tcPr>
-          <w:p>
-            <w:pPr>
-              <w:spacing w:after="160" w:line="259" w:lineRule="auto"/>
-              <w:ind w:left="0" w:firstLine="0"/>
-              <w:jc w:val="left"/>
-              <w:rPr>
-                <w:color w:val="000000" w:themeColor="text1"/>
-              </w:rPr>
-            </w:pPr>
-          </w:p>
-        </w:tc>
-        <w:tc>
-          <w:tcPr>
-            <w:tcW w:w="1682" w:type="dxa"/>
-          </w:tcPr>
-          <w:p>
-            <w:pPr>
-              <w:spacing w:after="0" w:line="259" w:lineRule="auto"/>
-              <w:ind w:left="0" w:firstLine="0"/>
-              <w:jc w:val="left"/>
-              <w:rPr>
-                <w:color w:val="000000" w:themeColor="text1"/>
-              </w:rPr>
-            </w:pPr>
+            <w:tcW w:type="dxa" w:w="2376"/>
+          </w:tcPr>
+          <w:p>
+            <w:r/>
             <w:r>
               <w:rPr>
                 <w:b/>
-                <w:color w:val="000000" w:themeColor="text1"/>
-                <w:sz w:val="18"/>
               </w:rPr>
               <w:t>Resultado</w:t>
             </w:r>
@@ -4768,692 +4224,232 @@
         </w:tc>
       </w:tr>
       <w:tr>
-        <w:trPr>
-          <w:trHeight w:val="380"/>
-        </w:trPr>
-        <w:tc>
-          <w:tcPr>
-            <w:tcW w:w="2493" w:type="dxa"/>
-          </w:tcPr>
-          <w:p>
-            <w:pPr>
-              <w:spacing w:after="0" w:line="259" w:lineRule="auto"/>
-              <w:ind w:left="100" w:firstLine="0"/>
-              <w:jc w:val="left"/>
-              <w:rPr>
-                <w:color w:val="000000" w:themeColor="text1"/>
-              </w:rPr>
-            </w:pPr>
-            <w:r>
-              <w:rPr>
-                <w:color w:val="000000" w:themeColor="text1"/>
-                <w:sz w:val="17"/>
-              </w:rPr>
+        <w:tc>
+          <w:tcPr>
+            <w:tcW w:type="dxa" w:w="2376"/>
+          </w:tcPr>
+          <w:p>
+            <w:r/>
+            <w:r>
               <w:t>a</w:t>
             </w:r>
           </w:p>
         </w:tc>
         <w:tc>
           <w:tcPr>
-            <w:tcW w:w="986" w:type="dxa"/>
-          </w:tcPr>
-          <w:p>
-            <w:pPr>
-              <w:spacing w:after="0" w:line="259" w:lineRule="auto"/>
-              <w:ind w:left="100" w:firstLine="0"/>
-              <w:jc w:val="left"/>
-              <w:rPr>
-                <w:color w:val="000000" w:themeColor="text1"/>
-              </w:rPr>
-            </w:pPr>
-            <w:r>
-              <w:rPr>
-                <w:color w:val="000000" w:themeColor="text1"/>
-                <w:sz w:val="17"/>
-              </w:rPr>
+            <w:tcW w:type="dxa" w:w="2376"/>
+          </w:tcPr>
+          <w:p>
+            <w:r/>
+            <w:r>
               <w:t>0</w:t>
             </w:r>
           </w:p>
         </w:tc>
         <w:tc>
           <w:tcPr>
-            <w:tcW w:w="1507" w:type="dxa"/>
-          </w:tcPr>
-          <w:p>
-            <w:pPr>
-              <w:spacing w:after="160" w:line="259" w:lineRule="auto"/>
-              <w:ind w:left="0" w:firstLine="0"/>
-              <w:jc w:val="left"/>
-              <w:rPr>
-                <w:color w:val="000000" w:themeColor="text1"/>
-              </w:rPr>
-            </w:pPr>
-          </w:p>
-        </w:tc>
-        <w:tc>
-          <w:tcPr>
-            <w:tcW w:w="921" w:type="dxa"/>
-          </w:tcPr>
-          <w:p>
-            <w:pPr>
-              <w:spacing w:after="0" w:line="259" w:lineRule="auto"/>
-              <w:ind w:left="100" w:firstLine="0"/>
-              <w:jc w:val="left"/>
-              <w:rPr>
-                <w:color w:val="000000" w:themeColor="text1"/>
-              </w:rPr>
-            </w:pPr>
-            <w:r>
-              <w:rPr>
-                <w:color w:val="000000" w:themeColor="text1"/>
-                <w:sz w:val="17"/>
-              </w:rPr>
+            <w:tcW w:type="dxa" w:w="2376"/>
+          </w:tcPr>
+          <w:p>
+            <w:r/>
+            <w:r>
               <w:t>5-1-0 = 4</w:t>
             </w:r>
           </w:p>
         </w:tc>
         <w:tc>
           <w:tcPr>
-            <w:tcW w:w="1572" w:type="dxa"/>
-          </w:tcPr>
-          <w:p>
-            <w:pPr>
-              <w:spacing w:after="160" w:line="259" w:lineRule="auto"/>
-              <w:ind w:left="0" w:firstLine="0"/>
-              <w:jc w:val="left"/>
-              <w:rPr>
-                <w:color w:val="000000" w:themeColor="text1"/>
-              </w:rPr>
-            </w:pPr>
-          </w:p>
-        </w:tc>
-        <w:tc>
-          <w:tcPr>
-            <w:tcW w:w="811" w:type="dxa"/>
-          </w:tcPr>
-          <w:p>
-            <w:pPr>
-              <w:spacing w:after="0" w:line="259" w:lineRule="auto"/>
-              <w:ind w:left="100" w:firstLine="0"/>
-              <w:jc w:val="left"/>
-              <w:rPr>
-                <w:color w:val="000000" w:themeColor="text1"/>
-              </w:rPr>
-            </w:pPr>
-            <w:r>
-              <w:rPr>
-                <w:color w:val="000000" w:themeColor="text1"/>
-                <w:sz w:val="17"/>
-              </w:rPr>
+            <w:tcW w:type="dxa" w:w="2376"/>
+          </w:tcPr>
+          <w:p>
+            <w:r/>
+            <w:r>
               <w:t>e</w:t>
             </w:r>
-          </w:p>
-        </w:tc>
-        <w:tc>
-          <w:tcPr>
-            <w:tcW w:w="1682" w:type="dxa"/>
-          </w:tcPr>
-          <w:p>
-            <w:pPr>
-              <w:spacing w:after="160" w:line="259" w:lineRule="auto"/>
-              <w:ind w:left="0" w:firstLine="0"/>
-              <w:jc w:val="left"/>
-              <w:rPr>
-                <w:color w:val="000000" w:themeColor="text1"/>
-              </w:rPr>
-            </w:pPr>
           </w:p>
         </w:tc>
       </w:tr>
       <w:tr>
-        <w:trPr>
-          <w:trHeight w:val="380"/>
-        </w:trPr>
-        <w:tc>
-          <w:tcPr>
-            <w:tcW w:w="2493" w:type="dxa"/>
-          </w:tcPr>
-          <w:p>
-            <w:pPr>
-              <w:spacing w:after="0" w:line="259" w:lineRule="auto"/>
-              <w:ind w:left="100" w:firstLine="0"/>
-              <w:jc w:val="left"/>
-              <w:rPr>
-                <w:color w:val="000000" w:themeColor="text1"/>
-              </w:rPr>
-            </w:pPr>
-            <w:r>
-              <w:rPr>
-                <w:color w:val="000000" w:themeColor="text1"/>
-                <w:sz w:val="17"/>
-              </w:rPr>
+        <w:tc>
+          <w:tcPr>
+            <w:tcW w:type="dxa" w:w="2376"/>
+          </w:tcPr>
+          <w:p>
+            <w:r/>
+            <w:r>
               <w:t>b</w:t>
             </w:r>
           </w:p>
         </w:tc>
         <w:tc>
           <w:tcPr>
-            <w:tcW w:w="986" w:type="dxa"/>
-          </w:tcPr>
-          <w:p>
-            <w:pPr>
-              <w:spacing w:after="0" w:line="259" w:lineRule="auto"/>
-              <w:ind w:left="100" w:firstLine="0"/>
-              <w:jc w:val="left"/>
-              <w:rPr>
-                <w:color w:val="000000" w:themeColor="text1"/>
-              </w:rPr>
-            </w:pPr>
-            <w:r>
-              <w:rPr>
-                <w:color w:val="000000" w:themeColor="text1"/>
-                <w:sz w:val="17"/>
-              </w:rPr>
+            <w:tcW w:type="dxa" w:w="2376"/>
+          </w:tcPr>
+          <w:p>
+            <w:r/>
+            <w:r>
               <w:t>1</w:t>
             </w:r>
           </w:p>
         </w:tc>
         <w:tc>
           <w:tcPr>
-            <w:tcW w:w="1507" w:type="dxa"/>
-          </w:tcPr>
-          <w:p>
-            <w:pPr>
-              <w:spacing w:after="160" w:line="259" w:lineRule="auto"/>
-              <w:ind w:left="0" w:firstLine="0"/>
-              <w:jc w:val="left"/>
-              <w:rPr>
-                <w:color w:val="000000" w:themeColor="text1"/>
-              </w:rPr>
-            </w:pPr>
-          </w:p>
-        </w:tc>
-        <w:tc>
-          <w:tcPr>
-            <w:tcW w:w="921" w:type="dxa"/>
-          </w:tcPr>
-          <w:p>
-            <w:pPr>
-              <w:spacing w:after="0" w:line="259" w:lineRule="auto"/>
-              <w:ind w:left="100" w:firstLine="0"/>
-              <w:jc w:val="left"/>
-              <w:rPr>
-                <w:color w:val="000000" w:themeColor="text1"/>
-              </w:rPr>
-            </w:pPr>
-            <w:r>
-              <w:rPr>
-                <w:color w:val="000000" w:themeColor="text1"/>
-                <w:sz w:val="17"/>
-              </w:rPr>
+            <w:tcW w:type="dxa" w:w="2376"/>
+          </w:tcPr>
+          <w:p>
+            <w:r/>
+            <w:r>
               <w:t>5-1-1 = 3</w:t>
             </w:r>
           </w:p>
         </w:tc>
         <w:tc>
           <w:tcPr>
-            <w:tcW w:w="1572" w:type="dxa"/>
-          </w:tcPr>
-          <w:p>
-            <w:pPr>
-              <w:spacing w:after="160" w:line="259" w:lineRule="auto"/>
-              <w:ind w:left="0" w:firstLine="0"/>
-              <w:jc w:val="left"/>
-              <w:rPr>
-                <w:color w:val="000000" w:themeColor="text1"/>
-              </w:rPr>
-            </w:pPr>
-          </w:p>
-        </w:tc>
-        <w:tc>
-          <w:tcPr>
-            <w:tcW w:w="811" w:type="dxa"/>
-          </w:tcPr>
-          <w:p>
-            <w:pPr>
-              <w:spacing w:after="0" w:line="259" w:lineRule="auto"/>
-              <w:ind w:left="100" w:firstLine="0"/>
-              <w:jc w:val="left"/>
-              <w:rPr>
-                <w:color w:val="000000" w:themeColor="text1"/>
-              </w:rPr>
-            </w:pPr>
-            <w:r>
-              <w:rPr>
-                <w:color w:val="000000" w:themeColor="text1"/>
-                <w:sz w:val="17"/>
-              </w:rPr>
+            <w:tcW w:type="dxa" w:w="2376"/>
+          </w:tcPr>
+          <w:p>
+            <w:r/>
+            <w:r>
               <w:t>d</w:t>
             </w:r>
-          </w:p>
-        </w:tc>
-        <w:tc>
-          <w:tcPr>
-            <w:tcW w:w="1682" w:type="dxa"/>
-          </w:tcPr>
-          <w:p>
-            <w:pPr>
-              <w:spacing w:after="160" w:line="259" w:lineRule="auto"/>
-              <w:ind w:left="0" w:firstLine="0"/>
-              <w:jc w:val="left"/>
-              <w:rPr>
-                <w:color w:val="000000" w:themeColor="text1"/>
-              </w:rPr>
-            </w:pPr>
           </w:p>
         </w:tc>
       </w:tr>
       <w:tr>
-        <w:trPr>
-          <w:trHeight w:val="380"/>
-        </w:trPr>
-        <w:tc>
-          <w:tcPr>
-            <w:tcW w:w="2493" w:type="dxa"/>
-          </w:tcPr>
-          <w:p>
-            <w:pPr>
-              <w:spacing w:after="0" w:line="259" w:lineRule="auto"/>
-              <w:ind w:left="100" w:firstLine="0"/>
-              <w:jc w:val="left"/>
-              <w:rPr>
-                <w:color w:val="000000" w:themeColor="text1"/>
-              </w:rPr>
-            </w:pPr>
-            <w:r>
-              <w:rPr>
-                <w:color w:val="000000" w:themeColor="text1"/>
-                <w:sz w:val="17"/>
-              </w:rPr>
+        <w:tc>
+          <w:tcPr>
+            <w:tcW w:type="dxa" w:w="2376"/>
+          </w:tcPr>
+          <w:p>
+            <w:r/>
+            <w:r>
               <w:t>c</w:t>
             </w:r>
           </w:p>
         </w:tc>
         <w:tc>
           <w:tcPr>
-            <w:tcW w:w="986" w:type="dxa"/>
-          </w:tcPr>
-          <w:p>
-            <w:pPr>
-              <w:spacing w:after="0" w:line="259" w:lineRule="auto"/>
-              <w:ind w:left="100" w:firstLine="0"/>
-              <w:jc w:val="left"/>
-              <w:rPr>
-                <w:color w:val="000000" w:themeColor="text1"/>
-              </w:rPr>
-            </w:pPr>
-            <w:r>
-              <w:rPr>
-                <w:color w:val="000000" w:themeColor="text1"/>
-                <w:sz w:val="17"/>
-              </w:rPr>
+            <w:tcW w:type="dxa" w:w="2376"/>
+          </w:tcPr>
+          <w:p>
+            <w:r/>
+            <w:r>
               <w:t>2</w:t>
             </w:r>
           </w:p>
         </w:tc>
         <w:tc>
           <w:tcPr>
-            <w:tcW w:w="1507" w:type="dxa"/>
-          </w:tcPr>
-          <w:p>
-            <w:pPr>
-              <w:spacing w:after="160" w:line="259" w:lineRule="auto"/>
-              <w:ind w:left="0" w:firstLine="0"/>
-              <w:jc w:val="left"/>
-              <w:rPr>
-                <w:color w:val="000000" w:themeColor="text1"/>
-              </w:rPr>
-            </w:pPr>
-          </w:p>
-        </w:tc>
-        <w:tc>
-          <w:tcPr>
-            <w:tcW w:w="921" w:type="dxa"/>
-          </w:tcPr>
-          <w:p>
-            <w:pPr>
-              <w:spacing w:after="0" w:line="259" w:lineRule="auto"/>
-              <w:ind w:left="100" w:firstLine="0"/>
-              <w:jc w:val="left"/>
-              <w:rPr>
-                <w:color w:val="000000" w:themeColor="text1"/>
-              </w:rPr>
-            </w:pPr>
-            <w:r>
-              <w:rPr>
-                <w:color w:val="000000" w:themeColor="text1"/>
-                <w:sz w:val="17"/>
-              </w:rPr>
+            <w:tcW w:type="dxa" w:w="2376"/>
+          </w:tcPr>
+          <w:p>
+            <w:r/>
+            <w:r>
               <w:t>5-1-2 = 2</w:t>
             </w:r>
           </w:p>
         </w:tc>
         <w:tc>
           <w:tcPr>
-            <w:tcW w:w="1572" w:type="dxa"/>
-          </w:tcPr>
-          <w:p>
-            <w:pPr>
-              <w:spacing w:after="160" w:line="259" w:lineRule="auto"/>
-              <w:ind w:left="0" w:firstLine="0"/>
-              <w:jc w:val="left"/>
-              <w:rPr>
-                <w:color w:val="000000" w:themeColor="text1"/>
-              </w:rPr>
-            </w:pPr>
-          </w:p>
-        </w:tc>
-        <w:tc>
-          <w:tcPr>
-            <w:tcW w:w="811" w:type="dxa"/>
-          </w:tcPr>
-          <w:p>
-            <w:pPr>
-              <w:spacing w:after="0" w:line="259" w:lineRule="auto"/>
-              <w:ind w:left="100" w:firstLine="0"/>
-              <w:jc w:val="left"/>
-              <w:rPr>
-                <w:color w:val="000000" w:themeColor="text1"/>
-              </w:rPr>
-            </w:pPr>
-            <w:r>
-              <w:rPr>
-                <w:color w:val="000000" w:themeColor="text1"/>
-                <w:sz w:val="17"/>
-              </w:rPr>
+            <w:tcW w:type="dxa" w:w="2376"/>
+          </w:tcPr>
+          <w:p>
+            <w:r/>
+            <w:r>
               <w:t>c</w:t>
             </w:r>
-          </w:p>
-        </w:tc>
-        <w:tc>
-          <w:tcPr>
-            <w:tcW w:w="1682" w:type="dxa"/>
-          </w:tcPr>
-          <w:p>
-            <w:pPr>
-              <w:spacing w:after="160" w:line="259" w:lineRule="auto"/>
-              <w:ind w:left="0" w:firstLine="0"/>
-              <w:jc w:val="left"/>
-              <w:rPr>
-                <w:color w:val="000000" w:themeColor="text1"/>
-              </w:rPr>
-            </w:pPr>
           </w:p>
         </w:tc>
       </w:tr>
       <w:tr>
-        <w:trPr>
-          <w:trHeight w:val="380"/>
-        </w:trPr>
-        <w:tc>
-          <w:tcPr>
-            <w:tcW w:w="2493" w:type="dxa"/>
-          </w:tcPr>
-          <w:p>
-            <w:pPr>
-              <w:spacing w:after="0" w:line="259" w:lineRule="auto"/>
-              <w:ind w:left="100" w:firstLine="0"/>
-              <w:jc w:val="left"/>
-              <w:rPr>
-                <w:color w:val="000000" w:themeColor="text1"/>
-              </w:rPr>
-            </w:pPr>
-            <w:r>
-              <w:rPr>
-                <w:color w:val="000000" w:themeColor="text1"/>
-                <w:sz w:val="17"/>
-              </w:rPr>
+        <w:tc>
+          <w:tcPr>
+            <w:tcW w:type="dxa" w:w="2376"/>
+          </w:tcPr>
+          <w:p>
+            <w:r/>
+            <w:r>
               <w:t>d</w:t>
             </w:r>
           </w:p>
         </w:tc>
         <w:tc>
           <w:tcPr>
-            <w:tcW w:w="986" w:type="dxa"/>
-          </w:tcPr>
-          <w:p>
-            <w:pPr>
-              <w:spacing w:after="0" w:line="259" w:lineRule="auto"/>
-              <w:ind w:left="100" w:firstLine="0"/>
-              <w:jc w:val="left"/>
-              <w:rPr>
-                <w:color w:val="000000" w:themeColor="text1"/>
-              </w:rPr>
-            </w:pPr>
-            <w:r>
-              <w:rPr>
-                <w:color w:val="000000" w:themeColor="text1"/>
-                <w:sz w:val="17"/>
-              </w:rPr>
+            <w:tcW w:type="dxa" w:w="2376"/>
+          </w:tcPr>
+          <w:p>
+            <w:r/>
+            <w:r>
               <w:t>3</w:t>
             </w:r>
           </w:p>
         </w:tc>
         <w:tc>
           <w:tcPr>
-            <w:tcW w:w="1507" w:type="dxa"/>
-          </w:tcPr>
-          <w:p>
-            <w:pPr>
-              <w:spacing w:after="160" w:line="259" w:lineRule="auto"/>
-              <w:ind w:left="0" w:firstLine="0"/>
-              <w:jc w:val="left"/>
-              <w:rPr>
-                <w:color w:val="000000" w:themeColor="text1"/>
-              </w:rPr>
-            </w:pPr>
-          </w:p>
-        </w:tc>
-        <w:tc>
-          <w:tcPr>
-            <w:tcW w:w="921" w:type="dxa"/>
-          </w:tcPr>
-          <w:p>
-            <w:pPr>
-              <w:spacing w:after="0" w:line="259" w:lineRule="auto"/>
-              <w:ind w:left="100" w:firstLine="0"/>
-              <w:jc w:val="left"/>
-              <w:rPr>
-                <w:color w:val="000000" w:themeColor="text1"/>
-              </w:rPr>
-            </w:pPr>
-            <w:r>
-              <w:rPr>
-                <w:color w:val="000000" w:themeColor="text1"/>
-                <w:sz w:val="17"/>
-              </w:rPr>
+            <w:tcW w:type="dxa" w:w="2376"/>
+          </w:tcPr>
+          <w:p>
+            <w:r/>
+            <w:r>
               <w:t>5-1-3 = 1</w:t>
             </w:r>
           </w:p>
         </w:tc>
         <w:tc>
           <w:tcPr>
-            <w:tcW w:w="1572" w:type="dxa"/>
-          </w:tcPr>
-          <w:p>
-            <w:pPr>
-              <w:spacing w:after="160" w:line="259" w:lineRule="auto"/>
-              <w:ind w:left="0" w:firstLine="0"/>
-              <w:jc w:val="left"/>
-              <w:rPr>
-                <w:color w:val="000000" w:themeColor="text1"/>
-              </w:rPr>
-            </w:pPr>
-          </w:p>
-        </w:tc>
-        <w:tc>
-          <w:tcPr>
-            <w:tcW w:w="811" w:type="dxa"/>
-          </w:tcPr>
-          <w:p>
-            <w:pPr>
-              <w:spacing w:after="0" w:line="259" w:lineRule="auto"/>
-              <w:ind w:left="100" w:firstLine="0"/>
-              <w:jc w:val="left"/>
-              <w:rPr>
-                <w:color w:val="000000" w:themeColor="text1"/>
-              </w:rPr>
-            </w:pPr>
-            <w:r>
-              <w:rPr>
-                <w:color w:val="000000" w:themeColor="text1"/>
-                <w:sz w:val="17"/>
-              </w:rPr>
+            <w:tcW w:type="dxa" w:w="2376"/>
+          </w:tcPr>
+          <w:p>
+            <w:r/>
+            <w:r>
               <w:t>b</w:t>
             </w:r>
-          </w:p>
-        </w:tc>
-        <w:tc>
-          <w:tcPr>
-            <w:tcW w:w="1682" w:type="dxa"/>
-          </w:tcPr>
-          <w:p>
-            <w:pPr>
-              <w:spacing w:after="160" w:line="259" w:lineRule="auto"/>
-              <w:ind w:left="0" w:firstLine="0"/>
-              <w:jc w:val="left"/>
-              <w:rPr>
-                <w:color w:val="000000" w:themeColor="text1"/>
-              </w:rPr>
-            </w:pPr>
           </w:p>
         </w:tc>
       </w:tr>
       <w:tr>
-        <w:trPr>
-          <w:trHeight w:val="380"/>
-        </w:trPr>
-        <w:tc>
-          <w:tcPr>
-            <w:tcW w:w="2493" w:type="dxa"/>
-          </w:tcPr>
-          <w:p>
-            <w:pPr>
-              <w:spacing w:after="0" w:line="259" w:lineRule="auto"/>
-              <w:ind w:left="100" w:firstLine="0"/>
-              <w:jc w:val="left"/>
-              <w:rPr>
-                <w:color w:val="000000" w:themeColor="text1"/>
-              </w:rPr>
-            </w:pPr>
-            <w:r>
-              <w:rPr>
-                <w:color w:val="000000" w:themeColor="text1"/>
-                <w:sz w:val="17"/>
-              </w:rPr>
+        <w:tc>
+          <w:tcPr>
+            <w:tcW w:type="dxa" w:w="2376"/>
+          </w:tcPr>
+          <w:p>
+            <w:r/>
+            <w:r>
               <w:t>e</w:t>
             </w:r>
           </w:p>
         </w:tc>
         <w:tc>
           <w:tcPr>
-            <w:tcW w:w="986" w:type="dxa"/>
-          </w:tcPr>
-          <w:p>
-            <w:pPr>
-              <w:spacing w:after="0" w:line="259" w:lineRule="auto"/>
-              <w:ind w:left="100" w:firstLine="0"/>
-              <w:jc w:val="left"/>
-              <w:rPr>
-                <w:color w:val="000000" w:themeColor="text1"/>
-              </w:rPr>
-            </w:pPr>
-            <w:r>
-              <w:rPr>
-                <w:color w:val="000000" w:themeColor="text1"/>
-                <w:sz w:val="17"/>
-              </w:rPr>
+            <w:tcW w:type="dxa" w:w="2376"/>
+          </w:tcPr>
+          <w:p>
+            <w:r/>
+            <w:r>
               <w:t>4</w:t>
             </w:r>
           </w:p>
         </w:tc>
         <w:tc>
           <w:tcPr>
-            <w:tcW w:w="1507" w:type="dxa"/>
-          </w:tcPr>
-          <w:p>
-            <w:pPr>
-              <w:spacing w:after="160" w:line="259" w:lineRule="auto"/>
-              <w:ind w:left="0" w:firstLine="0"/>
-              <w:jc w:val="left"/>
-              <w:rPr>
-                <w:color w:val="000000" w:themeColor="text1"/>
-              </w:rPr>
-            </w:pPr>
-          </w:p>
-        </w:tc>
-        <w:tc>
-          <w:tcPr>
-            <w:tcW w:w="921" w:type="dxa"/>
-          </w:tcPr>
-          <w:p>
-            <w:pPr>
-              <w:spacing w:after="0" w:line="259" w:lineRule="auto"/>
-              <w:ind w:left="100" w:firstLine="0"/>
-              <w:jc w:val="left"/>
-              <w:rPr>
-                <w:color w:val="000000" w:themeColor="text1"/>
-              </w:rPr>
-            </w:pPr>
-            <w:r>
-              <w:rPr>
-                <w:color w:val="000000" w:themeColor="text1"/>
-                <w:sz w:val="17"/>
-              </w:rPr>
+            <w:tcW w:type="dxa" w:w="2376"/>
+          </w:tcPr>
+          <w:p>
+            <w:r/>
+            <w:r>
               <w:t>5-1-4 = 0</w:t>
             </w:r>
           </w:p>
         </w:tc>
         <w:tc>
           <w:tcPr>
-            <w:tcW w:w="1572" w:type="dxa"/>
-          </w:tcPr>
-          <w:p>
-            <w:pPr>
-              <w:spacing w:after="160" w:line="259" w:lineRule="auto"/>
-              <w:ind w:left="0" w:firstLine="0"/>
-              <w:jc w:val="left"/>
-              <w:rPr>
-                <w:color w:val="000000" w:themeColor="text1"/>
-              </w:rPr>
-            </w:pPr>
-          </w:p>
-        </w:tc>
-        <w:tc>
-          <w:tcPr>
-            <w:tcW w:w="811" w:type="dxa"/>
-          </w:tcPr>
-          <w:p>
-            <w:pPr>
-              <w:spacing w:after="0" w:line="259" w:lineRule="auto"/>
-              <w:ind w:left="100" w:firstLine="0"/>
-              <w:jc w:val="left"/>
-              <w:rPr>
-                <w:color w:val="000000" w:themeColor="text1"/>
-              </w:rPr>
-            </w:pPr>
-            <w:r>
-              <w:rPr>
-                <w:color w:val="000000" w:themeColor="text1"/>
-                <w:sz w:val="17"/>
-              </w:rPr>
+            <w:tcW w:type="dxa" w:w="2376"/>
+          </w:tcPr>
+          <w:p>
+            <w:r/>
+            <w:r>
               <w:t>a</w:t>
             </w:r>
-          </w:p>
-        </w:tc>
-        <w:tc>
-          <w:tcPr>
-            <w:tcW w:w="1682" w:type="dxa"/>
-          </w:tcPr>
-          <w:p>
-            <w:pPr>
-              <w:spacing w:after="160" w:line="259" w:lineRule="auto"/>
-              <w:ind w:left="0" w:firstLine="0"/>
-              <w:jc w:val="left"/>
-              <w:rPr>
-                <w:color w:val="000000" w:themeColor="text1"/>
-              </w:rPr>
-            </w:pPr>
           </w:p>
         </w:tc>
       </w:tr>
@@ -5646,6 +4642,9 @@
           <w:color w:val="000000" w:themeColor="text1"/>
         </w:rPr>
         <w:t>", etc.), trigramas comunes [XTZ-04] ("que", "los", "las", "del", etc.) y palabras frecuentes [XTZ-05] ("el", "la", "de", "en", "un", etc.).</w:t>
+      </w:r>
+      <w:r>
+        <w:t xml:space="preserve"> Estos valores son datos de referencia del español basados en el Corpus de Referencia del Español Actual (CREA) [4], implementados en script.js como datos de trabajo del prototipo académico.</w:t>
       </w:r>
     </w:p>
     <w:p>
@@ -6222,7 +5221,7 @@
                 <w:color w:val="000000" w:themeColor="text1"/>
                 <w:sz w:val="17"/>
               </w:rPr>
-              <w:t>script.js:7</w:t>
+              <w:t>script.js</w:t>
             </w:r>
           </w:p>
         </w:tc>
@@ -6244,7 +5243,7 @@
                 <w:color w:val="000000" w:themeColor="text1"/>
                 <w:sz w:val="17"/>
               </w:rPr>
-              <w:t>Alfabeto activo, desplazamiento por defecto, alfabetos predefinidos.</w:t>
+              <w:t>Guarda el alfabeto activo, el desplazamiento por defecto, los alfabetos predefinidos (básico, extendido, ASCII, ASCII 7 bits) y las tablas del español con la lista de palabras comunes. Todo el programa lee y escribe este estado.</w:t>
             </w:r>
           </w:p>
         </w:tc>
@@ -6315,7 +5314,7 @@
                 <w:color w:val="000000" w:themeColor="text1"/>
                 <w:sz w:val="17"/>
               </w:rPr>
-              <w:t>script.js:40</w:t>
+              <w:t>script.js</w:t>
             </w:r>
           </w:p>
         </w:tc>
@@ -6337,7 +5336,7 @@
                 <w:color w:val="000000" w:themeColor="text1"/>
                 <w:sz w:val="17"/>
               </w:rPr>
-              <w:t>Frecuencias relativas de letras en español.</w:t>
+              <w:t>Frecuencia relativa de cada letra en español (ej. E 13.72%, A 12.53%, O 8.68%). Es el modelo esperado contra el que x12() y x13() comparan cada candidato.</w:t>
             </w:r>
           </w:p>
         </w:tc>
@@ -6417,7 +5416,7 @@
                 <w:color w:val="000000" w:themeColor="text1"/>
                 <w:sz w:val="17"/>
               </w:rPr>
-              <w:t>script.js:49</w:t>
+              <w:t>script.js</w:t>
             </w:r>
           </w:p>
         </w:tc>
@@ -6440,7 +5439,7 @@
                 <w:color w:val="000000" w:themeColor="text1"/>
                 <w:sz w:val="17"/>
               </w:rPr>
-              <w:t>Bigramas</w:t>
+              <w:t>Bigramas comunes del español con su peso (ej. 'de', 'la', 'el', 'en', 'qu'). Los usa x14b() para puntuar a cada candidato.</w:t>
             </w:r>
             <w:proofErr w:type="spellEnd"/>
             <w:r>
@@ -6448,7 +5447,6 @@
                 <w:color w:val="000000" w:themeColor="text1"/>
                 <w:sz w:val="17"/>
               </w:rPr>
-              <w:t xml:space="preserve"> comunes con puntuaciones.</w:t>
             </w:r>
           </w:p>
         </w:tc>
@@ -6521,7 +5519,7 @@
                 <w:color w:val="000000" w:themeColor="text1"/>
                 <w:sz w:val="17"/>
               </w:rPr>
-              <w:t>script.js:57</w:t>
+              <w:t>script.js</w:t>
             </w:r>
           </w:p>
         </w:tc>
@@ -6543,7 +5541,7 @@
                 <w:color w:val="000000" w:themeColor="text1"/>
                 <w:sz w:val="17"/>
               </w:rPr>
-              <w:t>Trigramas comunes.</w:t>
+              <w:t>Trigramas comunes del español (ej. 'que', 'los', 'las', 'del'). Los usa x14t() para puntuar a cada candidato.</w:t>
             </w:r>
           </w:p>
         </w:tc>
@@ -6614,7 +5612,7 @@
                 <w:color w:val="000000" w:themeColor="text1"/>
                 <w:sz w:val="17"/>
               </w:rPr>
-              <w:t>script.js:63</w:t>
+              <w:t>script.js</w:t>
             </w:r>
           </w:p>
         </w:tc>
@@ -6636,7 +5634,7 @@
                 <w:color w:val="000000" w:themeColor="text1"/>
                 <w:sz w:val="17"/>
               </w:rPr>
-              <w:t>Lista de palabras frecuentes del español.</w:t>
+              <w:t>Palabras frecuentes del español. Las usa x14w() contando coincidencias de palabra completa en el texto.</w:t>
             </w:r>
           </w:p>
         </w:tc>
@@ -6707,7 +5705,7 @@
                 <w:color w:val="000000" w:themeColor="text1"/>
                 <w:sz w:val="17"/>
               </w:rPr>
-              <w:t>script.js:71</w:t>
+              <w:t>script.js</w:t>
             </w:r>
           </w:p>
         </w:tc>
@@ -6729,7 +5727,7 @@
                 <w:color w:val="000000" w:themeColor="text1"/>
                 <w:sz w:val="17"/>
               </w:rPr>
-              <w:t>`</w:t>
+              <w:t>`x06()`: Fija el alfabeto activo tras validarlo con x06v(): no vacío, mínimo 2 caracteres y sin duplicados. Entrada: cadena del alfabeto. Salida: true/false y errores en la interfaz.</w:t>
             </w:r>
             <w:proofErr w:type="spellStart"/>
             <w:proofErr w:type="gramStart"/>
@@ -6738,7 +5736,6 @@
                 <w:color w:val="000000" w:themeColor="text1"/>
                 <w:sz w:val="17"/>
               </w:rPr>
-              <w:t>setAlphabet</w:t>
             </w:r>
             <w:proofErr w:type="spellEnd"/>
             <w:r>
@@ -6746,7 +5743,6 @@
                 <w:color w:val="000000" w:themeColor="text1"/>
                 <w:sz w:val="17"/>
               </w:rPr>
-              <w:t>(</w:t>
             </w:r>
             <w:proofErr w:type="gramEnd"/>
             <w:r>
@@ -6754,7 +5750,6 @@
                 <w:color w:val="000000" w:themeColor="text1"/>
                 <w:sz w:val="17"/>
               </w:rPr>
-              <w:t>)`: validación y establecimiento del alfabeto.</w:t>
             </w:r>
           </w:p>
         </w:tc>
@@ -6825,7 +5820,7 @@
                 <w:color w:val="000000" w:themeColor="text1"/>
                 <w:sz w:val="17"/>
               </w:rPr>
-              <w:t>script.js:141</w:t>
+              <w:t>script.js</w:t>
             </w:r>
           </w:p>
         </w:tc>
@@ -6847,7 +5842,7 @@
                 <w:color w:val="000000" w:themeColor="text1"/>
                 <w:sz w:val="17"/>
               </w:rPr>
-              <w:t>`</w:t>
+              <w:t>`x07()`: Desplaza cada carácter k posiciones con módulo n; lo que no pertenece al alfabeto se conserva. Entrada: texto, desplazamiento y alfabeto. Devuelve {result, charsTransformed, errors}. Se apoya en xN(), xG(), xGM() y xSh().</w:t>
             </w:r>
             <w:proofErr w:type="spellStart"/>
             <w:proofErr w:type="gramStart"/>
@@ -6856,7 +5851,6 @@
                 <w:color w:val="000000" w:themeColor="text1"/>
                 <w:sz w:val="17"/>
               </w:rPr>
-              <w:t>caesarEncrypt</w:t>
             </w:r>
             <w:proofErr w:type="spellEnd"/>
             <w:r>
@@ -6864,7 +5858,6 @@
                 <w:color w:val="000000" w:themeColor="text1"/>
                 <w:sz w:val="17"/>
               </w:rPr>
-              <w:t>(</w:t>
             </w:r>
             <w:proofErr w:type="gramEnd"/>
             <w:r>
@@ -6872,24 +5865,6 @@
                 <w:color w:val="000000" w:themeColor="text1"/>
                 <w:sz w:val="17"/>
               </w:rPr>
-              <w:t>)`:</w:t>
-            </w:r>
-          </w:p>
-          <w:p>
-            <w:pPr>
-              <w:spacing w:after="0" w:line="259" w:lineRule="auto"/>
-              <w:ind w:left="0" w:firstLine="0"/>
-              <w:jc w:val="left"/>
-              <w:rPr>
-                <w:color w:val="000000" w:themeColor="text1"/>
-              </w:rPr>
-            </w:pPr>
-            <w:r>
-              <w:rPr>
-                <w:color w:val="000000" w:themeColor="text1"/>
-                <w:sz w:val="17"/>
-              </w:rPr>
-              <w:t>implementación del cifrado César.</w:t>
             </w:r>
           </w:p>
         </w:tc>
@@ -7080,7 +6055,7 @@
                 <w:color w:val="000000" w:themeColor="text1"/>
                 <w:sz w:val="17"/>
               </w:rPr>
-              <w:t>script.js:162</w:t>
+              <w:t>script.js</w:t>
             </w:r>
           </w:p>
         </w:tc>
@@ -7102,7 +6077,7 @@
                 <w:color w:val="000000" w:themeColor="text1"/>
                 <w:sz w:val="17"/>
               </w:rPr>
-              <w:t>`</w:t>
+              <w:t>`x08()`: Descifra reutilizando x07() con desplazamiento negativo. Misma entrada y salida que x07().</w:t>
             </w:r>
             <w:proofErr w:type="spellStart"/>
             <w:proofErr w:type="gramStart"/>
@@ -7111,7 +6086,6 @@
                 <w:color w:val="000000" w:themeColor="text1"/>
                 <w:sz w:val="17"/>
               </w:rPr>
-              <w:t>caesarDecrypt</w:t>
             </w:r>
             <w:proofErr w:type="spellEnd"/>
             <w:r>
@@ -7119,7 +6093,6 @@
                 <w:color w:val="000000" w:themeColor="text1"/>
                 <w:sz w:val="17"/>
               </w:rPr>
-              <w:t>(</w:t>
             </w:r>
             <w:proofErr w:type="gramEnd"/>
             <w:r>
@@ -7127,7 +6100,6 @@
                 <w:color w:val="000000" w:themeColor="text1"/>
                 <w:sz w:val="17"/>
               </w:rPr>
-              <w:t>)`: descifrado César.</w:t>
             </w:r>
           </w:p>
         </w:tc>
@@ -7198,7 +6170,7 @@
                 <w:color w:val="000000" w:themeColor="text1"/>
                 <w:sz w:val="17"/>
               </w:rPr>
-              <w:t>script.js:168,187</w:t>
+              <w:t>script.js</w:t>
             </w:r>
           </w:p>
         </w:tc>
@@ -7220,7 +6192,7 @@
                 <w:color w:val="000000" w:themeColor="text1"/>
                 <w:sz w:val="17"/>
               </w:rPr>
-              <w:t>`</w:t>
+              <w:t>`x09()/x09i()`: Sustituye cada carácter por su espejo (n-1-i). Sin clave y simétricas: aplicar dos veces devuelve el original. Se apoyan en xG() y xGM().</w:t>
             </w:r>
             <w:proofErr w:type="spellStart"/>
             <w:r>
@@ -7228,7 +6200,6 @@
                 <w:color w:val="000000" w:themeColor="text1"/>
                 <w:sz w:val="17"/>
               </w:rPr>
-              <w:t>atbashEncrypt</w:t>
             </w:r>
             <w:proofErr w:type="spellEnd"/>
             <w:r>
@@ -7236,7 +6207,6 @@
                 <w:color w:val="000000" w:themeColor="text1"/>
                 <w:sz w:val="17"/>
               </w:rPr>
-              <w:t>/</w:t>
             </w:r>
             <w:proofErr w:type="spellStart"/>
             <w:r>
@@ -7244,7 +6214,6 @@
                 <w:color w:val="000000" w:themeColor="text1"/>
                 <w:sz w:val="17"/>
               </w:rPr>
-              <w:t>atbashDecrypt</w:t>
             </w:r>
             <w:proofErr w:type="spellEnd"/>
             <w:r>
@@ -7252,7 +6221,6 @@
                 <w:color w:val="000000" w:themeColor="text1"/>
                 <w:sz w:val="17"/>
               </w:rPr>
-              <w:t xml:space="preserve"> </w:t>
             </w:r>
             <w:proofErr w:type="gramStart"/>
             <w:r>
@@ -7260,7 +6228,6 @@
                 <w:color w:val="000000" w:themeColor="text1"/>
                 <w:sz w:val="17"/>
               </w:rPr>
-              <w:t>()`</w:t>
             </w:r>
             <w:proofErr w:type="gramEnd"/>
             <w:r>
@@ -7268,7 +6235,6 @@
                 <w:color w:val="000000" w:themeColor="text1"/>
                 <w:sz w:val="17"/>
               </w:rPr>
-              <w:t>: inversión del alfabeto.</w:t>
             </w:r>
           </w:p>
         </w:tc>
@@ -7339,7 +6305,7 @@
                 <w:color w:val="000000" w:themeColor="text1"/>
                 <w:sz w:val="17"/>
               </w:rPr>
-              <w:t>script.js:212</w:t>
+              <w:t>script.js</w:t>
             </w:r>
           </w:p>
         </w:tc>
@@ -7361,7 +6327,7 @@
                 <w:color w:val="000000" w:themeColor="text1"/>
                 <w:sz w:val="17"/>
               </w:rPr>
-              <w:t>`</w:t>
+              <w:t>`x11()`: Reduce cualquier entero positivo o negativo al rango 0 a n-1 con módulo. Entrada: desplazamiento y n. Salida: entero normalizado.</w:t>
             </w:r>
             <w:proofErr w:type="spellStart"/>
             <w:proofErr w:type="gramStart"/>
@@ -7370,7 +6336,6 @@
                 <w:color w:val="000000" w:themeColor="text1"/>
                 <w:sz w:val="17"/>
               </w:rPr>
-              <w:t>normalizeShift</w:t>
             </w:r>
             <w:proofErr w:type="spellEnd"/>
             <w:r>
@@ -7378,7 +6343,6 @@
                 <w:color w:val="000000" w:themeColor="text1"/>
                 <w:sz w:val="17"/>
               </w:rPr>
-              <w:t>(</w:t>
             </w:r>
             <w:proofErr w:type="gramEnd"/>
             <w:r>
@@ -7386,7 +6350,6 @@
                 <w:color w:val="000000" w:themeColor="text1"/>
                 <w:sz w:val="17"/>
               </w:rPr>
-              <w:t>)`: ajusta el desplazamiento al rango válido.</w:t>
             </w:r>
           </w:p>
         </w:tc>
@@ -7457,7 +6420,7 @@
                 <w:color w:val="000000" w:themeColor="text1"/>
                 <w:sz w:val="17"/>
               </w:rPr>
-              <w:t>script.js:221</w:t>
+              <w:t>script.js</w:t>
             </w:r>
           </w:p>
         </w:tc>
@@ -7479,7 +6442,7 @@
                 <w:color w:val="000000" w:themeColor="text1"/>
                 <w:sz w:val="17"/>
               </w:rPr>
-              <w:t>`</w:t>
+              <w:t>`x12()`: Cuenta las apariciones de cada carácter y las divide entre el total. Entrada: texto y alfabeto. Salida: {freq, total}.</w:t>
             </w:r>
             <w:proofErr w:type="spellStart"/>
             <w:proofErr w:type="gramStart"/>
@@ -7488,7 +6451,6 @@
                 <w:color w:val="000000" w:themeColor="text1"/>
                 <w:sz w:val="17"/>
               </w:rPr>
-              <w:t>calculateFrequencies</w:t>
             </w:r>
             <w:proofErr w:type="spellEnd"/>
             <w:r>
@@ -7496,7 +6458,6 @@
                 <w:color w:val="000000" w:themeColor="text1"/>
                 <w:sz w:val="17"/>
               </w:rPr>
-              <w:t>(</w:t>
             </w:r>
             <w:proofErr w:type="gramEnd"/>
             <w:r>
@@ -7504,24 +6465,6 @@
                 <w:color w:val="000000" w:themeColor="text1"/>
                 <w:sz w:val="17"/>
               </w:rPr>
-              <w:t>)`:</w:t>
-            </w:r>
-          </w:p>
-          <w:p>
-            <w:pPr>
-              <w:spacing w:after="0" w:line="259" w:lineRule="auto"/>
-              <w:ind w:left="0" w:firstLine="0"/>
-              <w:jc w:val="left"/>
-              <w:rPr>
-                <w:color w:val="000000" w:themeColor="text1"/>
-              </w:rPr>
-            </w:pPr>
-            <w:r>
-              <w:rPr>
-                <w:color w:val="000000" w:themeColor="text1"/>
-                <w:sz w:val="17"/>
-              </w:rPr>
-              <w:t>calcula frecuencias observadas.</w:t>
             </w:r>
           </w:p>
         </w:tc>
@@ -7592,7 +6535,7 @@
                 <w:color w:val="000000" w:themeColor="text1"/>
                 <w:sz w:val="17"/>
               </w:rPr>
-              <w:t>script.js:238</w:t>
+              <w:t>script.js</w:t>
             </w:r>
           </w:p>
         </w:tc>
@@ -7614,7 +6557,7 @@
                 <w:color w:val="000000" w:themeColor="text1"/>
                 <w:sz w:val="17"/>
               </w:rPr>
-              <w:t>`</w:t>
+              <w:t>`x13()`: Suma (obs-esp)²/esp por carácter. Entrada: frecuencias observadas, esperadas y alfabeto. Salida: número; 0 es coincidencia perfecta y los valores chicos indican español probable.</w:t>
             </w:r>
             <w:proofErr w:type="spellStart"/>
             <w:proofErr w:type="gramStart"/>
@@ -7623,7 +6566,6 @@
                 <w:color w:val="000000" w:themeColor="text1"/>
                 <w:sz w:val="17"/>
               </w:rPr>
-              <w:t>chiSquared</w:t>
             </w:r>
             <w:proofErr w:type="spellEnd"/>
             <w:r>
@@ -7631,7 +6573,6 @@
                 <w:color w:val="000000" w:themeColor="text1"/>
                 <w:sz w:val="17"/>
               </w:rPr>
-              <w:t>(</w:t>
             </w:r>
             <w:proofErr w:type="gramEnd"/>
             <w:r>
@@ -7639,7 +6580,6 @@
                 <w:color w:val="000000" w:themeColor="text1"/>
                 <w:sz w:val="17"/>
               </w:rPr>
-              <w:t xml:space="preserve">)`: calcula la distancia </w:t>
             </w:r>
             <w:r>
               <w:rPr>
@@ -7647,14 +6587,12 @@
                 <w:color w:val="000000" w:themeColor="text1"/>
                 <w:sz w:val="17"/>
               </w:rPr>
-              <w:t>χ</w:t>
-            </w:r>
-            <w:r>
-              <w:rPr>
-                <w:color w:val="000000" w:themeColor="text1"/>
-                <w:sz w:val="17"/>
-              </w:rPr>
-              <w:t>².</w:t>
+            </w:r>
+            <w:r>
+              <w:rPr>
+                <w:color w:val="000000" w:themeColor="text1"/>
+                <w:sz w:val="17"/>
+              </w:rPr>
             </w:r>
           </w:p>
         </w:tc>
@@ -7725,7 +6663,7 @@
                 <w:color w:val="000000" w:themeColor="text1"/>
                 <w:sz w:val="17"/>
               </w:rPr>
-              <w:t>script.js:254,265,276</w:t>
+              <w:t>script.js</w:t>
             </w:r>
           </w:p>
         </w:tc>
@@ -7747,7 +6685,7 @@
                 <w:color w:val="000000" w:themeColor="text1"/>
                 <w:sz w:val="17"/>
               </w:rPr>
-              <w:t>`</w:t>
+              <w:t>`x14b(), x14t(), x14w()`: Cuentan bigramas, trigramas y palabras comunes en minúsculas. Entrada: texto y tablas. Salida: puntajes numéricos que usa x15().</w:t>
             </w:r>
             <w:proofErr w:type="spellStart"/>
             <w:r>
@@ -7755,7 +6693,6 @@
                 <w:color w:val="000000" w:themeColor="text1"/>
                 <w:sz w:val="17"/>
               </w:rPr>
-              <w:t>countBigrams</w:t>
             </w:r>
             <w:proofErr w:type="spellEnd"/>
             <w:r>
@@ -7763,7 +6700,6 @@
                 <w:color w:val="000000" w:themeColor="text1"/>
                 <w:sz w:val="17"/>
               </w:rPr>
-              <w:t xml:space="preserve">, </w:t>
             </w:r>
             <w:proofErr w:type="spellStart"/>
             <w:r>
@@ -7771,7 +6707,6 @@
                 <w:color w:val="000000" w:themeColor="text1"/>
                 <w:sz w:val="17"/>
               </w:rPr>
-              <w:t>countTrigrams</w:t>
             </w:r>
             <w:proofErr w:type="spellEnd"/>
             <w:r>
@@ -7779,7 +6714,6 @@
                 <w:color w:val="000000" w:themeColor="text1"/>
                 <w:sz w:val="17"/>
               </w:rPr>
-              <w:t xml:space="preserve">, </w:t>
             </w:r>
             <w:proofErr w:type="spellStart"/>
             <w:r>
@@ -7787,7 +6721,6 @@
                 <w:color w:val="000000" w:themeColor="text1"/>
                 <w:sz w:val="17"/>
               </w:rPr>
-              <w:t>countCommonWords</w:t>
             </w:r>
             <w:proofErr w:type="spellEnd"/>
             <w:r>
@@ -7795,7 +6728,6 @@
                 <w:color w:val="000000" w:themeColor="text1"/>
                 <w:sz w:val="17"/>
               </w:rPr>
-              <w:t>`.</w:t>
             </w:r>
           </w:p>
         </w:tc>
@@ -7867,7 +6799,7 @@
                 <w:color w:val="000000" w:themeColor="text1"/>
                 <w:sz w:val="17"/>
               </w:rPr>
-              <w:t>script.js:288</w:t>
+              <w:t>script.js</w:t>
             </w:r>
           </w:p>
         </w:tc>
@@ -7889,7 +6821,7 @@
                 <w:color w:val="000000" w:themeColor="text1"/>
                 <w:sz w:val="17"/>
               </w:rPr>
-              <w:t>`</w:t>
+              <w:t>`x15()`: Combina los tres conteos con pesos 0.3/0.2/0.5. Entrada: texto y alfabeto. Salida: {bigramScore, trigramScore, wordScore, total}.</w:t>
             </w:r>
             <w:proofErr w:type="spellStart"/>
             <w:proofErr w:type="gramStart"/>
@@ -7898,7 +6830,6 @@
                 <w:color w:val="000000" w:themeColor="text1"/>
                 <w:sz w:val="17"/>
               </w:rPr>
-              <w:t>calculateLinguisticScore</w:t>
             </w:r>
             <w:proofErr w:type="spellEnd"/>
             <w:r>
@@ -7906,7 +6837,6 @@
                 <w:color w:val="000000" w:themeColor="text1"/>
                 <w:sz w:val="17"/>
               </w:rPr>
-              <w:t>(</w:t>
             </w:r>
             <w:proofErr w:type="gramEnd"/>
             <w:r>
@@ -7914,7 +6844,6 @@
                 <w:color w:val="000000" w:themeColor="text1"/>
                 <w:sz w:val="17"/>
               </w:rPr>
-              <w:t xml:space="preserve">)`: combina </w:t>
             </w:r>
             <w:proofErr w:type="spellStart"/>
             <w:r>
@@ -7922,7 +6851,6 @@
                 <w:color w:val="000000" w:themeColor="text1"/>
                 <w:sz w:val="17"/>
               </w:rPr>
-              <w:t>bigramas</w:t>
             </w:r>
             <w:proofErr w:type="spellEnd"/>
             <w:r>
@@ -7930,7 +6858,6 @@
                 <w:color w:val="000000" w:themeColor="text1"/>
                 <w:sz w:val="17"/>
               </w:rPr>
-              <w:t>, trigramas y palabras.</w:t>
             </w:r>
           </w:p>
         </w:tc>
@@ -8001,7 +6928,7 @@
                 <w:color w:val="000000" w:themeColor="text1"/>
                 <w:sz w:val="17"/>
               </w:rPr>
-              <w:t>script.js:302</w:t>
+              <w:t>script.js</w:t>
             </w:r>
           </w:p>
         </w:tc>
@@ -8023,7 +6950,7 @@
                 <w:color w:val="000000" w:themeColor="text1"/>
                 <w:sz w:val="17"/>
               </w:rPr>
-              <w:t>`</w:t>
+              <w:t>`x16()`: Junta frecuencia (x12()+x13() convertida a 1/(1+χ²)) y lengua (x15() normalizada entre 10 con tope 1) con pesos 0.4/0.6. Salida: {chiSquared, freqScore, lingScore, combined}.</w:t>
             </w:r>
             <w:proofErr w:type="spellStart"/>
             <w:proofErr w:type="gramStart"/>
@@ -8032,7 +6959,6 @@
                 <w:color w:val="000000" w:themeColor="text1"/>
                 <w:sz w:val="17"/>
               </w:rPr>
-              <w:t>combinedScore</w:t>
             </w:r>
             <w:proofErr w:type="spellEnd"/>
             <w:r>
@@ -8040,7 +6966,6 @@
                 <w:color w:val="000000" w:themeColor="text1"/>
                 <w:sz w:val="17"/>
               </w:rPr>
-              <w:t>(</w:t>
             </w:r>
             <w:proofErr w:type="gramEnd"/>
             <w:r>
@@ -8048,7 +6973,6 @@
                 <w:color w:val="000000" w:themeColor="text1"/>
                 <w:sz w:val="17"/>
               </w:rPr>
-              <w:t xml:space="preserve">)`: 0.4 × </w:t>
             </w:r>
             <w:proofErr w:type="spellStart"/>
             <w:r>
@@ -8056,7 +6980,6 @@
                 <w:color w:val="000000" w:themeColor="text1"/>
                 <w:sz w:val="17"/>
               </w:rPr>
-              <w:t>freqScore</w:t>
             </w:r>
             <w:proofErr w:type="spellEnd"/>
             <w:r>
@@ -8064,7 +6987,6 @@
                 <w:color w:val="000000" w:themeColor="text1"/>
                 <w:sz w:val="17"/>
               </w:rPr>
-              <w:t xml:space="preserve"> + 0.6 × </w:t>
             </w:r>
             <w:proofErr w:type="spellStart"/>
             <w:r>
@@ -8072,7 +6994,6 @@
                 <w:color w:val="000000" w:themeColor="text1"/>
                 <w:sz w:val="17"/>
               </w:rPr>
-              <w:t>lingScore</w:t>
             </w:r>
             <w:proofErr w:type="spellEnd"/>
             <w:r>
@@ -8080,7 +7001,6 @@
                 <w:color w:val="000000" w:themeColor="text1"/>
                 <w:sz w:val="17"/>
               </w:rPr>
-              <w:t>.</w:t>
             </w:r>
           </w:p>
         </w:tc>
@@ -8151,7 +7071,7 @@
                 <w:color w:val="000000" w:themeColor="text1"/>
                 <w:sz w:val="17"/>
               </w:rPr>
-              <w:t>script.js:319</w:t>
+              <w:t>script.js</w:t>
             </w:r>
           </w:p>
         </w:tc>
@@ -8173,7 +7093,7 @@
                 <w:color w:val="000000" w:themeColor="text1"/>
                 <w:sz w:val="17"/>
               </w:rPr>
-              <w:t>`</w:t>
+              <w:t>`x17()`: Genera un candidato por cada desplazamiento de 0 a n-1 usando x08(). Entrada: cifrado y alfabeto. Salida: arreglo de {text, method, shift, charsTransformed}.</w:t>
             </w:r>
             <w:proofErr w:type="spellStart"/>
             <w:proofErr w:type="gramStart"/>
@@ -8182,7 +7102,6 @@
                 <w:color w:val="000000" w:themeColor="text1"/>
                 <w:sz w:val="17"/>
               </w:rPr>
-              <w:t>generateCesarCandidates</w:t>
             </w:r>
             <w:proofErr w:type="spellEnd"/>
             <w:r>
@@ -8190,7 +7109,6 @@
                 <w:color w:val="000000" w:themeColor="text1"/>
                 <w:sz w:val="17"/>
               </w:rPr>
-              <w:t>(</w:t>
             </w:r>
             <w:proofErr w:type="gramEnd"/>
             <w:r>
@@ -8198,7 +7116,6 @@
                 <w:color w:val="000000" w:themeColor="text1"/>
                 <w:sz w:val="17"/>
               </w:rPr>
-              <w:t>)`: genera n candidatos, uno por desplazamiento.</w:t>
             </w:r>
           </w:p>
         </w:tc>
@@ -8269,7 +7186,7 @@
                 <w:color w:val="000000" w:themeColor="text1"/>
                 <w:sz w:val="17"/>
               </w:rPr>
-              <w:t>script.js:346</w:t>
+              <w:t>script.js</w:t>
             </w:r>
           </w:p>
         </w:tc>
@@ -8291,7 +7208,7 @@
                 <w:color w:val="000000" w:themeColor="text1"/>
                 <w:sz w:val="17"/>
               </w:rPr>
-              <w:t>`</w:t>
+              <w:t>`x18()`: Compara los dos mejores puntajes; si la diferencia relativa es menor a 5% marca ambigüedad. Entrada: candidatos ordenados. Salida: {ambiguous, gap, topScores}.</w:t>
             </w:r>
             <w:proofErr w:type="spellStart"/>
             <w:proofErr w:type="gramStart"/>
@@ -8300,7 +7217,6 @@
                 <w:color w:val="000000" w:themeColor="text1"/>
                 <w:sz w:val="17"/>
               </w:rPr>
-              <w:t>detectAmbiguity</w:t>
             </w:r>
             <w:proofErr w:type="spellEnd"/>
             <w:r>
@@ -8308,7 +7224,6 @@
                 <w:color w:val="000000" w:themeColor="text1"/>
                 <w:sz w:val="17"/>
               </w:rPr>
-              <w:t>(</w:t>
             </w:r>
             <w:proofErr w:type="gramEnd"/>
             <w:r>
@@ -8316,7 +7231,6 @@
                 <w:color w:val="000000" w:themeColor="text1"/>
                 <w:sz w:val="17"/>
               </w:rPr>
-              <w:t>)`: determina si los dos mejores candidatos son similares.</w:t>
             </w:r>
           </w:p>
         </w:tc>
@@ -8387,7 +7301,7 @@
                 <w:color w:val="000000" w:themeColor="text1"/>
                 <w:sz w:val="17"/>
               </w:rPr>
-              <w:t>script.js:362</w:t>
+              <w:t>script.js</w:t>
             </w:r>
           </w:p>
         </w:tc>
@@ -8409,7 +7323,7 @@
                 <w:color w:val="000000" w:themeColor="text1"/>
                 <w:sz w:val="17"/>
               </w:rPr>
-              <w:t>`</w:t>
+              <w:t>`x19()`: Genera los candidatos de x17() más el de x20(), los puntúa con x16(), los ordena y devuelve {winner, allCandidates, ambiguity, isAmbiguous}.</w:t>
             </w:r>
             <w:proofErr w:type="spellStart"/>
             <w:proofErr w:type="gramStart"/>
@@ -8418,7 +7332,6 @@
                 <w:color w:val="000000" w:themeColor="text1"/>
                 <w:sz w:val="17"/>
               </w:rPr>
-              <w:t>autoDecrypt</w:t>
             </w:r>
             <w:proofErr w:type="spellEnd"/>
             <w:r>
@@ -8426,7 +7339,6 @@
                 <w:color w:val="000000" w:themeColor="text1"/>
                 <w:sz w:val="17"/>
               </w:rPr>
-              <w:t>(</w:t>
             </w:r>
             <w:proofErr w:type="gramEnd"/>
             <w:r>
@@ -8434,7 +7346,6 @@
                 <w:color w:val="000000" w:themeColor="text1"/>
                 <w:sz w:val="17"/>
               </w:rPr>
-              <w:t>)`: orquestación de generación, evaluación y selección.</w:t>
             </w:r>
           </w:p>
         </w:tc>
@@ -8505,7 +7416,7 @@
                 <w:color w:val="000000" w:themeColor="text1"/>
                 <w:sz w:val="17"/>
               </w:rPr>
-              <w:t>script.js:335</w:t>
+              <w:t>script.js</w:t>
             </w:r>
           </w:p>
         </w:tc>
@@ -8527,7 +7438,7 @@
                 <w:color w:val="000000" w:themeColor="text1"/>
                 <w:sz w:val="17"/>
               </w:rPr>
-              <w:t>`</w:t>
+              <w:t>`x20()`: Aplica x09i() una sola vez y devuelve el único candidato Atbash {text, method, shift nulo, charsTransformed}.</w:t>
             </w:r>
             <w:proofErr w:type="spellStart"/>
             <w:proofErr w:type="gramStart"/>
@@ -8536,7 +7447,6 @@
                 <w:color w:val="000000" w:themeColor="text1"/>
                 <w:sz w:val="17"/>
               </w:rPr>
-              <w:t>generateAtbashCandidate</w:t>
             </w:r>
             <w:proofErr w:type="spellEnd"/>
             <w:r>
@@ -8544,7 +7454,6 @@
                 <w:color w:val="000000" w:themeColor="text1"/>
                 <w:sz w:val="17"/>
               </w:rPr>
-              <w:t>(</w:t>
             </w:r>
             <w:proofErr w:type="gramEnd"/>
             <w:r>
@@ -8552,7 +7461,6 @@
                 <w:color w:val="000000" w:themeColor="text1"/>
                 <w:sz w:val="17"/>
               </w:rPr>
-              <w:t>)`: genera el candidato Atbash.</w:t>
             </w:r>
           </w:p>
         </w:tc>
@@ -8623,7 +7531,7 @@
                 <w:color w:val="000000" w:themeColor="text1"/>
                 <w:sz w:val="17"/>
               </w:rPr>
-              <w:t>script.js:385</w:t>
+              <w:t>script.js</w:t>
             </w:r>
           </w:p>
         </w:tc>
@@ -8645,7 +7553,7 @@
                 <w:color w:val="000000" w:themeColor="text1"/>
                 <w:sz w:val="17"/>
               </w:rPr>
-              <w:t>`</w:t>
+              <w:t>`x21()`: Lee el modo (uO()), el método (uM()) y el desplazamiento (uS()) de la interfaz, normaliza con x11() y despacha a x07()/x09(), x08()/x09i() o x19(). Sin parámetros: escribe el resultado en la página.</w:t>
             </w:r>
             <w:proofErr w:type="spellStart"/>
             <w:proofErr w:type="gramStart"/>
@@ -8654,7 +7562,6 @@
                 <w:color w:val="000000" w:themeColor="text1"/>
                 <w:sz w:val="17"/>
               </w:rPr>
-              <w:t>processText</w:t>
             </w:r>
             <w:proofErr w:type="spellEnd"/>
             <w:r>
@@ -8662,7 +7569,6 @@
                 <w:color w:val="000000" w:themeColor="text1"/>
                 <w:sz w:val="17"/>
               </w:rPr>
-              <w:t>(</w:t>
             </w:r>
             <w:proofErr w:type="gramEnd"/>
             <w:r>
@@ -8670,7 +7576,6 @@
                 <w:color w:val="000000" w:themeColor="text1"/>
                 <w:sz w:val="17"/>
               </w:rPr>
-              <w:t>)`: despachador de cifrar, descifrar manual y automático.</w:t>
             </w:r>
           </w:p>
         </w:tc>
@@ -8741,7 +7646,7 @@
                 <w:color w:val="000000" w:themeColor="text1"/>
                 <w:sz w:val="17"/>
               </w:rPr>
-              <w:t>script.js:538</w:t>
+              <w:t>script.js</w:t>
             </w:r>
           </w:p>
         </w:tc>
@@ -8763,7 +7668,7 @@
                 <w:color w:val="000000" w:themeColor="text1"/>
                 <w:sz w:val="17"/>
               </w:rPr>
-              <w:t>`</w:t>
+              <w:t>`x22`: Framework con rs(), lg(), ok(), eq() y rp(), más las pruebas v01 a v07 y vAll que verifican cifrado, bordes, round-trip y autodetección.</w:t>
             </w:r>
             <w:proofErr w:type="spellStart"/>
             <w:r>
@@ -8771,7 +7676,6 @@
                 <w:color w:val="000000" w:themeColor="text1"/>
                 <w:sz w:val="17"/>
               </w:rPr>
-              <w:t>TestEngine</w:t>
             </w:r>
             <w:proofErr w:type="spellEnd"/>
             <w:r>
@@ -8779,7 +7683,6 @@
                 <w:color w:val="000000" w:themeColor="text1"/>
                 <w:sz w:val="17"/>
               </w:rPr>
-              <w:t xml:space="preserve">`: </w:t>
             </w:r>
             <w:proofErr w:type="spellStart"/>
             <w:r>
@@ -8787,7 +7690,6 @@
                 <w:color w:val="000000" w:themeColor="text1"/>
                 <w:sz w:val="17"/>
               </w:rPr>
-              <w:t>framework</w:t>
             </w:r>
             <w:proofErr w:type="spellEnd"/>
             <w:r>
@@ -8795,7 +7697,6 @@
                 <w:color w:val="000000" w:themeColor="text1"/>
                 <w:sz w:val="17"/>
               </w:rPr>
-              <w:t xml:space="preserve"> de </w:t>
             </w:r>
             <w:proofErr w:type="spellStart"/>
             <w:r>
@@ -8803,7 +7704,6 @@
                 <w:color w:val="000000" w:themeColor="text1"/>
                 <w:sz w:val="17"/>
               </w:rPr>
-              <w:t>assertions</w:t>
             </w:r>
             <w:proofErr w:type="spellEnd"/>
             <w:r>
@@ -8811,7 +7711,6 @@
                 <w:color w:val="000000" w:themeColor="text1"/>
                 <w:sz w:val="17"/>
               </w:rPr>
-              <w:t xml:space="preserve"> y reportes.</w:t>
             </w:r>
           </w:p>
         </w:tc>
@@ -8882,7 +7781,7 @@
                 <w:color w:val="000000" w:themeColor="text1"/>
                 <w:sz w:val="17"/>
               </w:rPr>
-              <w:t>script.js:496</w:t>
+              <w:t>script.js</w:t>
             </w:r>
           </w:p>
         </w:tc>
@@ -8904,7 +7803,7 @@
                 <w:color w:val="000000" w:themeColor="text1"/>
                 <w:sz w:val="17"/>
               </w:rPr>
-              <w:t>`</w:t>
+              <w:t>`uO()`: Lee el modo seleccionado en la interfaz (cifrar, descifrar o automático). Salida: cadena del modo.</w:t>
             </w:r>
             <w:proofErr w:type="spellStart"/>
             <w:proofErr w:type="gramStart"/>
@@ -8913,7 +7812,6 @@
                 <w:color w:val="000000" w:themeColor="text1"/>
                 <w:sz w:val="17"/>
               </w:rPr>
-              <w:t>getOperationMode</w:t>
             </w:r>
             <w:proofErr w:type="spellEnd"/>
             <w:r>
@@ -8921,7 +7819,6 @@
                 <w:color w:val="000000" w:themeColor="text1"/>
                 <w:sz w:val="17"/>
               </w:rPr>
-              <w:t>(</w:t>
             </w:r>
             <w:proofErr w:type="gramEnd"/>
             <w:r>
@@ -8929,7 +7826,6 @@
                 <w:color w:val="000000" w:themeColor="text1"/>
                 <w:sz w:val="17"/>
               </w:rPr>
-              <w:t>)`: lee el modo seleccionado.</w:t>
             </w:r>
           </w:p>
         </w:tc>
@@ -9000,7 +7896,7 @@
                 <w:color w:val="000000" w:themeColor="text1"/>
                 <w:sz w:val="17"/>
               </w:rPr>
-              <w:t>script.js:505</w:t>
+              <w:t>script.js</w:t>
             </w:r>
           </w:p>
         </w:tc>
@@ -9022,7 +7918,7 @@
                 <w:color w:val="000000" w:themeColor="text1"/>
                 <w:sz w:val="17"/>
               </w:rPr>
-              <w:t>`</w:t>
+              <w:t>`dMU()`: Muestra u oculta el panel manual y cambia el botón según el modo, apoyándose en uO().</w:t>
             </w:r>
             <w:proofErr w:type="spellStart"/>
             <w:proofErr w:type="gramStart"/>
@@ -9031,7 +7927,6 @@
                 <w:color w:val="000000" w:themeColor="text1"/>
                 <w:sz w:val="17"/>
               </w:rPr>
-              <w:t>updateModeUI</w:t>
             </w:r>
             <w:proofErr w:type="spellEnd"/>
             <w:r>
@@ -9039,7 +7934,6 @@
                 <w:color w:val="000000" w:themeColor="text1"/>
                 <w:sz w:val="17"/>
               </w:rPr>
-              <w:t>(</w:t>
             </w:r>
             <w:proofErr w:type="gramEnd"/>
             <w:r>
@@ -9047,7 +7941,6 @@
                 <w:color w:val="000000" w:themeColor="text1"/>
                 <w:sz w:val="17"/>
               </w:rPr>
-              <w:t>)`: adapta la interfaz según el modo.</w:t>
             </w:r>
           </w:p>
         </w:tc>
@@ -9118,7 +8011,7 @@
                 <w:color w:val="000000" w:themeColor="text1"/>
                 <w:sz w:val="17"/>
               </w:rPr>
-              <w:t>script.js:528</w:t>
+              <w:t>script.js</w:t>
             </w:r>
           </w:p>
         </w:tc>
@@ -9140,7 +8033,7 @@
                 <w:color w:val="000000" w:themeColor="text1"/>
                 <w:sz w:val="17"/>
               </w:rPr>
-              <w:t>`</w:t>
+              <w:t>`dMM()`: Muestra las opciones de César o la nota de Atbash según el método, apoyándose en uM().</w:t>
             </w:r>
             <w:proofErr w:type="spellStart"/>
             <w:proofErr w:type="gramStart"/>
@@ -9149,7 +8042,6 @@
                 <w:color w:val="000000" w:themeColor="text1"/>
                 <w:sz w:val="17"/>
               </w:rPr>
-              <w:t>updateMethodUI</w:t>
             </w:r>
             <w:proofErr w:type="spellEnd"/>
             <w:r>
@@ -9157,7 +8049,6 @@
                 <w:color w:val="000000" w:themeColor="text1"/>
                 <w:sz w:val="17"/>
               </w:rPr>
-              <w:t>(</w:t>
             </w:r>
             <w:proofErr w:type="gramEnd"/>
             <w:r>
@@ -9165,24 +8056,6 @@
                 <w:color w:val="000000" w:themeColor="text1"/>
                 <w:sz w:val="17"/>
               </w:rPr>
-              <w:t>)`:</w:t>
-            </w:r>
-          </w:p>
-          <w:p>
-            <w:pPr>
-              <w:spacing w:after="0" w:line="259" w:lineRule="auto"/>
-              <w:ind w:left="0" w:firstLine="0"/>
-              <w:jc w:val="left"/>
-              <w:rPr>
-                <w:color w:val="000000" w:themeColor="text1"/>
-              </w:rPr>
-            </w:pPr>
-            <w:r>
-              <w:rPr>
-                <w:color w:val="000000" w:themeColor="text1"/>
-                <w:sz w:val="17"/>
-              </w:rPr>
-              <w:t>muestra/oculta opciones de César o Atbash.</w:t>
             </w:r>
           </w:p>
         </w:tc>
@@ -9253,7 +8126,7 @@
                 <w:color w:val="000000" w:themeColor="text1"/>
                 <w:sz w:val="17"/>
               </w:rPr>
-              <w:t>script.js:680</w:t>
+              <w:t>script.js</w:t>
             </w:r>
           </w:p>
         </w:tc>
@@ -9275,7 +8148,7 @@
                 <w:color w:val="000000" w:themeColor="text1"/>
                 <w:sz w:val="17"/>
               </w:rPr>
-              <w:t>`</w:t>
+              <w:t>`boot()`: Fija el alfabeto inicial, conecta todos los botones y deja la interfaz lista. Se ejecuta al cargar la página.</w:t>
             </w:r>
             <w:proofErr w:type="spellStart"/>
             <w:proofErr w:type="gramStart"/>
@@ -9284,7 +8157,6 @@
                 <w:color w:val="000000" w:themeColor="text1"/>
                 <w:sz w:val="17"/>
               </w:rPr>
-              <w:t>init</w:t>
             </w:r>
             <w:proofErr w:type="spellEnd"/>
             <w:r>
@@ -9292,7 +8164,6 @@
                 <w:color w:val="000000" w:themeColor="text1"/>
                 <w:sz w:val="17"/>
               </w:rPr>
-              <w:t>(</w:t>
             </w:r>
             <w:proofErr w:type="gramEnd"/>
             <w:r>
@@ -9300,7 +8171,6 @@
                 <w:color w:val="000000" w:themeColor="text1"/>
                 <w:sz w:val="17"/>
               </w:rPr>
-              <w:t>)`: configuración inicial de la aplicación.</w:t>
             </w:r>
           </w:p>
         </w:tc>
@@ -9405,21 +8275,20 @@
         <w:rPr>
           <w:color w:val="000000" w:themeColor="text1"/>
         </w:rPr>
-        <w:t>El repositorio contiene los archivos del proyecto: index.html, styles.css, script.js y la documentación técnica en archivos .</w:t>
+        <w:t>El repositorio contiene los archivos del proyecto: index.html, styles.css, script.js y este documento como documentación</w:t>
       </w:r>
       <w:proofErr w:type="spellStart"/>
       <w:r>
         <w:rPr>
           <w:color w:val="000000" w:themeColor="text1"/>
         </w:rPr>
-        <w:t>md</w:t>
       </w:r>
       <w:proofErr w:type="spellEnd"/>
       <w:r>
         <w:rPr>
           <w:color w:val="000000" w:themeColor="text1"/>
         </w:rPr>
-        <w:t xml:space="preserve"> separados.</w:t>
+        <w:t xml:space="preserve"> principal.</w:t>
       </w:r>
     </w:p>
     <w:p>
@@ -9607,134 +8476,28 @@
         </w:rPr>
       </w:pPr>
       <w:r>
-        <w:rPr>
-          <w:color w:val="000000" w:themeColor="text1"/>
-        </w:rPr>
-        <w:t xml:space="preserve">Al-Kindi, Abu Yusuf Ya'qub </w:t>
-      </w:r>
-      <w:proofErr w:type="spellStart"/>
-      <w:r>
-        <w:rPr>
-          <w:color w:val="000000" w:themeColor="text1"/>
-        </w:rPr>
-        <w:t>ibn</w:t>
-      </w:r>
-      <w:proofErr w:type="spellEnd"/>
-      <w:r>
-        <w:rPr>
-          <w:color w:val="000000" w:themeColor="text1"/>
-        </w:rPr>
-        <w:t xml:space="preserve"> Ishaq al-Sabbah. </w:t>
-      </w:r>
-      <w:proofErr w:type="spellStart"/>
-      <w:r>
-        <w:rPr>
-          <w:b/>
-          <w:bCs/>
+        <w:t xml:space="preserve">Kahn, David. </w:t>
+      </w:r>
+      <w:r>
+        <w:rPr>
           <w:i/>
-          <w:color w:val="000000" w:themeColor="text1"/>
-        </w:rPr>
-        <w:t>Risāla</w:t>
-      </w:r>
-      <w:proofErr w:type="spellEnd"/>
-      <w:r>
-        <w:rPr>
-          <w:b/>
-          <w:bCs/>
-          <w:i/>
-          <w:color w:val="000000" w:themeColor="text1"/>
-        </w:rPr>
-        <w:t xml:space="preserve"> </w:t>
-      </w:r>
-      <w:proofErr w:type="spellStart"/>
-      <w:r>
-        <w:rPr>
-          <w:b/>
-          <w:bCs/>
-          <w:i/>
-          <w:color w:val="000000" w:themeColor="text1"/>
-        </w:rPr>
-        <w:t>fī</w:t>
-      </w:r>
-      <w:proofErr w:type="spellEnd"/>
-      <w:r>
-        <w:rPr>
-          <w:b/>
-          <w:bCs/>
-          <w:i/>
-          <w:color w:val="000000" w:themeColor="text1"/>
-        </w:rPr>
-        <w:t xml:space="preserve"> </w:t>
-      </w:r>
-      <w:proofErr w:type="spellStart"/>
-      <w:r>
-        <w:rPr>
-          <w:b/>
-          <w:bCs/>
-          <w:i/>
-          <w:color w:val="000000" w:themeColor="text1"/>
-        </w:rPr>
-        <w:t>Istikhrāj</w:t>
-      </w:r>
-      <w:proofErr w:type="spellEnd"/>
-      <w:r>
-        <w:rPr>
-          <w:b/>
-          <w:bCs/>
-          <w:i/>
-          <w:color w:val="000000" w:themeColor="text1"/>
-        </w:rPr>
-        <w:t xml:space="preserve"> al-</w:t>
-      </w:r>
-      <w:proofErr w:type="spellStart"/>
-      <w:r>
-        <w:rPr>
-          <w:b/>
-          <w:bCs/>
-          <w:i/>
-          <w:color w:val="000000" w:themeColor="text1"/>
-        </w:rPr>
-        <w:t>Muʿammā</w:t>
-      </w:r>
-      <w:proofErr w:type="spellEnd"/>
-      <w:r>
-        <w:rPr>
-          <w:i/>
-          <w:color w:val="000000" w:themeColor="text1"/>
-        </w:rPr>
-        <w:t xml:space="preserve"> </w:t>
-      </w:r>
-      <w:r>
-        <w:rPr>
-          <w:color w:val="000000" w:themeColor="text1"/>
-        </w:rPr>
-        <w:t xml:space="preserve">(Manuscrito sobre </w:t>
-      </w:r>
-      <w:r>
-        <w:rPr>
-          <w:color w:val="000000" w:themeColor="text1"/>
-        </w:rPr>
-        <w:t>el desciframiento</w:t>
-      </w:r>
-      <w:r>
-        <w:rPr>
-          <w:color w:val="000000" w:themeColor="text1"/>
-        </w:rPr>
-        <w:t xml:space="preserve"> de mensajes criptográficos). Siglo IX d.C. </w:t>
-      </w:r>
-      <w:proofErr w:type="spellStart"/>
-      <w:r>
-        <w:rPr>
-          <w:color w:val="000000" w:themeColor="text1"/>
-        </w:rPr>
-        <w:t>Baghdad</w:t>
-      </w:r>
-      <w:proofErr w:type="spellEnd"/>
-      <w:r>
-        <w:rPr>
-          <w:color w:val="000000" w:themeColor="text1"/>
-        </w:rPr>
-        <w:t>.</w:t>
+        </w:rPr>
+        <w:t>The Codebreakers: The Story of Secret Writing</w:t>
+      </w:r>
+      <w:r>
+        <w:t xml:space="preserve">. Macmillan Publishers, Nueva York, 1967. ISBN 978-0-671-65947-5. </w:t>
+      </w:r>
+      <w:hyperlink r:id="rId17">
+        <w:r>
+          <w:rPr>
+            <w:color w:val="0000FF"/>
+            <w:u w:val="single"/>
+          </w:rPr>
+          <w:t>https://openlibrary.org/works/OL2543107W/The_codebreakers</w:t>
+        </w:r>
+      </w:hyperlink>
+      <w:r>
+        <w:t xml:space="preserve"> — Contexto histórico de los cifrados clásicos y de los orígenes del criptoanálisis (César, Atbash y el aporte de Al-Kindi).</w:t>
       </w:r>
     </w:p>
     <w:p>
@@ -9751,64 +8514,28 @@
         </w:rPr>
       </w:pPr>
       <w:r>
-        <w:rPr>
-          <w:color w:val="000000" w:themeColor="text1"/>
-        </w:rPr>
-        <w:t xml:space="preserve">Kahn, David. </w:t>
+        <w:t xml:space="preserve">Singh, Simon. </w:t>
       </w:r>
       <w:r>
         <w:rPr>
           <w:i/>
-          <w:color w:val="000000" w:themeColor="text1"/>
-        </w:rPr>
-        <w:t xml:space="preserve">The </w:t>
-      </w:r>
-      <w:proofErr w:type="spellStart"/>
-      <w:r>
-        <w:rPr>
-          <w:i/>
-          <w:color w:val="000000" w:themeColor="text1"/>
-        </w:rPr>
-        <w:t>Codebreakers</w:t>
-      </w:r>
-      <w:proofErr w:type="spellEnd"/>
-      <w:r>
-        <w:rPr>
-          <w:i/>
-          <w:color w:val="000000" w:themeColor="text1"/>
-        </w:rPr>
-        <w:t xml:space="preserve">: The Story </w:t>
-      </w:r>
-      <w:proofErr w:type="spellStart"/>
-      <w:r>
-        <w:rPr>
-          <w:i/>
-          <w:color w:val="000000" w:themeColor="text1"/>
-        </w:rPr>
-        <w:t>of</w:t>
-      </w:r>
-      <w:proofErr w:type="spellEnd"/>
-      <w:r>
-        <w:rPr>
-          <w:i/>
-          <w:color w:val="000000" w:themeColor="text1"/>
-        </w:rPr>
-        <w:t xml:space="preserve"> Secret </w:t>
-      </w:r>
-      <w:proofErr w:type="spellStart"/>
-      <w:r>
-        <w:rPr>
-          <w:i/>
-          <w:color w:val="000000" w:themeColor="text1"/>
-        </w:rPr>
-        <w:t>Writing</w:t>
-      </w:r>
-      <w:proofErr w:type="spellEnd"/>
-      <w:r>
-        <w:rPr>
-          <w:color w:val="000000" w:themeColor="text1"/>
-        </w:rPr>
-        <w:t>. Macmillan Publishers, Nueva York, 1967. ISBN 978-0-671-65947-5.</w:t>
+        </w:rPr>
+        <w:t>The Code Book: The Science of Secrecy from Ancient Egypt to Quantum Cryptography</w:t>
+      </w:r>
+      <w:r>
+        <w:t xml:space="preserve">. Anchor Books, Nueva York, 1999. ISBN 978-0-385-49532-5. </w:t>
+      </w:r>
+      <w:hyperlink r:id="rId18">
+        <w:r>
+          <w:rPr>
+            <w:color w:val="0000FF"/>
+            <w:u w:val="single"/>
+          </w:rPr>
+          <w:t>https://simonsingh.net/books/the-code-book/</w:t>
+        </w:r>
+      </w:hyperlink>
+      <w:r>
+        <w:t xml:space="preserve"> — Explicación del análisis de frecuencia aplicado en el descifrado automático del proyecto.</w:t>
       </w:r>
     </w:p>
     <w:p>
@@ -9825,142 +8552,28 @@
         </w:rPr>
       </w:pPr>
       <w:r>
-        <w:rPr>
-          <w:color w:val="000000" w:themeColor="text1"/>
-        </w:rPr>
-        <w:t xml:space="preserve">Singh, </w:t>
-      </w:r>
-      <w:proofErr w:type="spellStart"/>
-      <w:r>
-        <w:rPr>
-          <w:color w:val="000000" w:themeColor="text1"/>
-        </w:rPr>
-        <w:t>Simon</w:t>
-      </w:r>
-      <w:proofErr w:type="spellEnd"/>
-      <w:r>
-        <w:rPr>
-          <w:color w:val="000000" w:themeColor="text1"/>
-        </w:rPr>
-        <w:t xml:space="preserve">. </w:t>
+        <w:t xml:space="preserve">National Institute of Standards and Technology. </w:t>
       </w:r>
       <w:r>
         <w:rPr>
           <w:i/>
-          <w:color w:val="000000" w:themeColor="text1"/>
-        </w:rPr>
-        <w:t xml:space="preserve">The Code Book: The </w:t>
-      </w:r>
-      <w:proofErr w:type="spellStart"/>
-      <w:r>
-        <w:rPr>
-          <w:i/>
-          <w:color w:val="000000" w:themeColor="text1"/>
-        </w:rPr>
-        <w:t>Science</w:t>
-      </w:r>
-      <w:proofErr w:type="spellEnd"/>
-      <w:r>
-        <w:rPr>
-          <w:i/>
-          <w:color w:val="000000" w:themeColor="text1"/>
-        </w:rPr>
-        <w:t xml:space="preserve"> </w:t>
-      </w:r>
-      <w:proofErr w:type="spellStart"/>
-      <w:r>
-        <w:rPr>
-          <w:i/>
-          <w:color w:val="000000" w:themeColor="text1"/>
-        </w:rPr>
-        <w:t>of</w:t>
-      </w:r>
-      <w:proofErr w:type="spellEnd"/>
-      <w:r>
-        <w:rPr>
-          <w:i/>
-          <w:color w:val="000000" w:themeColor="text1"/>
-        </w:rPr>
-        <w:t xml:space="preserve"> </w:t>
-      </w:r>
-      <w:proofErr w:type="spellStart"/>
-      <w:r>
-        <w:rPr>
-          <w:i/>
-          <w:color w:val="000000" w:themeColor="text1"/>
-        </w:rPr>
-        <w:t>Secrecy</w:t>
-      </w:r>
-      <w:proofErr w:type="spellEnd"/>
-      <w:r>
-        <w:rPr>
-          <w:i/>
-          <w:color w:val="000000" w:themeColor="text1"/>
-        </w:rPr>
-        <w:t xml:space="preserve"> </w:t>
-      </w:r>
-      <w:proofErr w:type="spellStart"/>
-      <w:r>
-        <w:rPr>
-          <w:i/>
-          <w:color w:val="000000" w:themeColor="text1"/>
-        </w:rPr>
-        <w:t>from</w:t>
-      </w:r>
-      <w:proofErr w:type="spellEnd"/>
-      <w:r>
-        <w:rPr>
-          <w:i/>
-          <w:color w:val="000000" w:themeColor="text1"/>
-        </w:rPr>
-        <w:t xml:space="preserve"> </w:t>
-      </w:r>
-      <w:proofErr w:type="spellStart"/>
-      <w:r>
-        <w:rPr>
-          <w:i/>
-          <w:color w:val="000000" w:themeColor="text1"/>
-        </w:rPr>
-        <w:t>Ancient</w:t>
-      </w:r>
-      <w:proofErr w:type="spellEnd"/>
-      <w:r>
-        <w:rPr>
-          <w:i/>
-          <w:color w:val="000000" w:themeColor="text1"/>
-        </w:rPr>
-        <w:t xml:space="preserve"> Egypt </w:t>
-      </w:r>
-      <w:proofErr w:type="spellStart"/>
-      <w:r>
-        <w:rPr>
-          <w:i/>
-          <w:color w:val="000000" w:themeColor="text1"/>
-        </w:rPr>
-        <w:t>to</w:t>
-      </w:r>
-      <w:proofErr w:type="spellEnd"/>
-      <w:r>
-        <w:rPr>
-          <w:i/>
-          <w:color w:val="000000" w:themeColor="text1"/>
-        </w:rPr>
-        <w:t xml:space="preserve"> Quantum </w:t>
-      </w:r>
-      <w:proofErr w:type="spellStart"/>
-      <w:r>
-        <w:rPr>
-          <w:i/>
-          <w:color w:val="000000" w:themeColor="text1"/>
-        </w:rPr>
-        <w:t>Cryptography</w:t>
-      </w:r>
-      <w:proofErr w:type="spellEnd"/>
-      <w:r>
-        <w:rPr>
-          <w:color w:val="000000" w:themeColor="text1"/>
-        </w:rPr>
-        <w:t>. Anchor Books, Nueva York, 1999. ISBN 978-0-385-49532-5.</w:t>
+        </w:rPr>
+        <w:t>Advanced Encryption Standard (AES)</w:t>
+      </w:r>
+      <w:r>
+        <w:t xml:space="preserve">. FIPS PUB 197. U.S. Department of Commerce, 2001. </w:t>
+      </w:r>
+      <w:hyperlink r:id="rId19">
+        <w:r>
+          <w:rPr>
+            <w:color w:val="0000FF"/>
+            <w:u w:val="single"/>
+          </w:rPr>
+          <w:t>https://doi.org/10.6028/NIST.FIPS.197</w:t>
+        </w:r>
+      </w:hyperlink>
+      <w:r>
+        <w:t xml:space="preserve"> — Referencia del estándar moderno que se usa como contraste frente a los cifrados clásicos del proyecto.</w:t>
       </w:r>
     </w:p>
     <w:p>
@@ -9970,700 +8583,36 @@
           <w:ilvl w:val="0"/>
           <w:numId w:val="14"/>
         </w:numPr>
-        <w:spacing w:after="49"/>
-        <w:ind w:right="7"/>
-        <w:rPr>
-          <w:color w:val="000000" w:themeColor="text1"/>
-        </w:rPr>
-      </w:pPr>
-      <w:proofErr w:type="spellStart"/>
-      <w:r>
-        <w:rPr>
-          <w:color w:val="000000" w:themeColor="text1"/>
-        </w:rPr>
-        <w:t>Alvarez</w:t>
-      </w:r>
-      <w:proofErr w:type="spellEnd"/>
-      <w:r>
-        <w:rPr>
-          <w:color w:val="000000" w:themeColor="text1"/>
-        </w:rPr>
-        <w:t xml:space="preserve">, G.; Nunez, J.; Valenzuela, C. y otros. "A </w:t>
-      </w:r>
-      <w:proofErr w:type="spellStart"/>
-      <w:r>
-        <w:rPr>
-          <w:color w:val="000000" w:themeColor="text1"/>
-        </w:rPr>
-        <w:t>cryptanalysis</w:t>
-      </w:r>
-      <w:proofErr w:type="spellEnd"/>
-      <w:r>
-        <w:rPr>
-          <w:color w:val="000000" w:themeColor="text1"/>
-        </w:rPr>
-        <w:t xml:space="preserve"> </w:t>
-      </w:r>
-      <w:proofErr w:type="spellStart"/>
-      <w:r>
-        <w:rPr>
-          <w:color w:val="000000" w:themeColor="text1"/>
-        </w:rPr>
-        <w:t>of</w:t>
-      </w:r>
-      <w:proofErr w:type="spellEnd"/>
-      <w:r>
-        <w:rPr>
-          <w:color w:val="000000" w:themeColor="text1"/>
-        </w:rPr>
-        <w:t xml:space="preserve"> </w:t>
-      </w:r>
-      <w:proofErr w:type="spellStart"/>
-      <w:r>
-        <w:rPr>
-          <w:color w:val="000000" w:themeColor="text1"/>
-        </w:rPr>
-        <w:t>the</w:t>
-      </w:r>
-      <w:proofErr w:type="spellEnd"/>
-      <w:r>
-        <w:rPr>
-          <w:color w:val="000000" w:themeColor="text1"/>
-        </w:rPr>
-        <w:t xml:space="preserve"> </w:t>
-      </w:r>
-      <w:proofErr w:type="spellStart"/>
-      <w:r>
-        <w:rPr>
-          <w:color w:val="000000" w:themeColor="text1"/>
-        </w:rPr>
-        <w:t>classical</w:t>
-      </w:r>
-      <w:proofErr w:type="spellEnd"/>
-      <w:r>
-        <w:rPr>
-          <w:color w:val="000000" w:themeColor="text1"/>
-        </w:rPr>
-        <w:t xml:space="preserve"> </w:t>
-      </w:r>
-      <w:proofErr w:type="spellStart"/>
-      <w:r>
-        <w:rPr>
-          <w:color w:val="000000" w:themeColor="text1"/>
-        </w:rPr>
-        <w:t>cipher</w:t>
-      </w:r>
-      <w:proofErr w:type="spellEnd"/>
-      <w:r>
-        <w:rPr>
-          <w:color w:val="000000" w:themeColor="text1"/>
-        </w:rPr>
-        <w:t xml:space="preserve">." </w:t>
-      </w:r>
-      <w:proofErr w:type="spellStart"/>
+        <w:spacing w:after="37" w:line="286" w:lineRule="auto"/>
+        <w:jc w:val="left"/>
+        <w:rPr>
+          <w:color w:val="000000" w:themeColor="text1"/>
+        </w:rPr>
+      </w:pPr>
+      <w:r>
+        <w:t xml:space="preserve">Real Academia Española. Banco de datos (CREA). </w:t>
+      </w:r>
       <w:r>
         <w:rPr>
           <w:i/>
-          <w:color w:val="000000" w:themeColor="text1"/>
-        </w:rPr>
-        <w:t>Journal</w:t>
-      </w:r>
-      <w:proofErr w:type="spellEnd"/>
-      <w:r>
-        <w:rPr>
-          <w:i/>
-          <w:color w:val="000000" w:themeColor="text1"/>
-        </w:rPr>
-        <w:t xml:space="preserve"> </w:t>
-      </w:r>
-      <w:proofErr w:type="spellStart"/>
-      <w:r>
-        <w:rPr>
-          <w:i/>
-          <w:color w:val="000000" w:themeColor="text1"/>
-        </w:rPr>
-        <w:t>of</w:t>
-      </w:r>
-      <w:proofErr w:type="spellEnd"/>
-      <w:r>
-        <w:rPr>
-          <w:i/>
-          <w:color w:val="000000" w:themeColor="text1"/>
-        </w:rPr>
-        <w:t xml:space="preserve"> </w:t>
-      </w:r>
-      <w:proofErr w:type="spellStart"/>
-      <w:r>
-        <w:rPr>
-          <w:i/>
-          <w:color w:val="000000" w:themeColor="text1"/>
-        </w:rPr>
-        <w:t>the</w:t>
-      </w:r>
-      <w:proofErr w:type="spellEnd"/>
-      <w:r>
-        <w:rPr>
-          <w:i/>
-          <w:color w:val="000000" w:themeColor="text1"/>
-        </w:rPr>
-        <w:t xml:space="preserve"> American </w:t>
-      </w:r>
-      <w:proofErr w:type="spellStart"/>
-      <w:r>
-        <w:rPr>
-          <w:i/>
-          <w:color w:val="000000" w:themeColor="text1"/>
-        </w:rPr>
-        <w:t>Society</w:t>
-      </w:r>
-      <w:proofErr w:type="spellEnd"/>
-      <w:r>
-        <w:rPr>
-          <w:i/>
-          <w:color w:val="000000" w:themeColor="text1"/>
-        </w:rPr>
-        <w:t xml:space="preserve"> </w:t>
-      </w:r>
-      <w:proofErr w:type="spellStart"/>
-      <w:r>
-        <w:rPr>
-          <w:i/>
-          <w:color w:val="000000" w:themeColor="text1"/>
-        </w:rPr>
-        <w:t>for</w:t>
-      </w:r>
-      <w:proofErr w:type="spellEnd"/>
-      <w:r>
-        <w:rPr>
-          <w:i/>
-          <w:color w:val="000000" w:themeColor="text1"/>
-        </w:rPr>
-        <w:t xml:space="preserve"> </w:t>
-      </w:r>
-      <w:proofErr w:type="spellStart"/>
-      <w:r>
-        <w:rPr>
-          <w:i/>
-          <w:color w:val="000000" w:themeColor="text1"/>
-        </w:rPr>
-        <w:t>Information</w:t>
-      </w:r>
-      <w:proofErr w:type="spellEnd"/>
-      <w:r>
-        <w:rPr>
-          <w:i/>
-          <w:color w:val="000000" w:themeColor="text1"/>
-        </w:rPr>
-        <w:t xml:space="preserve"> </w:t>
-      </w:r>
-      <w:proofErr w:type="spellStart"/>
-      <w:r>
-        <w:rPr>
-          <w:i/>
-          <w:color w:val="000000" w:themeColor="text1"/>
-        </w:rPr>
-        <w:t>Science</w:t>
-      </w:r>
-      <w:proofErr w:type="spellEnd"/>
-      <w:r>
-        <w:rPr>
-          <w:i/>
-          <w:color w:val="000000" w:themeColor="text1"/>
-        </w:rPr>
-        <w:t xml:space="preserve"> and </w:t>
-      </w:r>
-      <w:proofErr w:type="spellStart"/>
-      <w:r>
-        <w:rPr>
-          <w:i/>
-          <w:color w:val="000000" w:themeColor="text1"/>
-        </w:rPr>
-        <w:t>Technology</w:t>
-      </w:r>
-      <w:proofErr w:type="spellEnd"/>
-      <w:r>
-        <w:rPr>
-          <w:color w:val="000000" w:themeColor="text1"/>
-        </w:rPr>
-        <w:t>, vol. 58, no. 5, 2007, pp. 683-691.</w:t>
-      </w:r>
-    </w:p>
-    <w:p>
-      <w:pPr>
-        <w:pStyle w:val="Prrafodelista"/>
-        <w:numPr>
-          <w:ilvl w:val="0"/>
-          <w:numId w:val="14"/>
-        </w:numPr>
-        <w:spacing w:after="49"/>
-        <w:ind w:right="7"/>
-        <w:rPr>
-          <w:color w:val="000000" w:themeColor="text1"/>
-        </w:rPr>
-      </w:pPr>
-      <w:r>
-        <w:rPr>
-          <w:color w:val="000000" w:themeColor="text1"/>
-        </w:rPr>
-        <w:t xml:space="preserve">Schneier, Bruce. </w:t>
-      </w:r>
-      <w:proofErr w:type="spellStart"/>
-      <w:r>
-        <w:rPr>
-          <w:i/>
-          <w:color w:val="000000" w:themeColor="text1"/>
-        </w:rPr>
-        <w:t>Applied</w:t>
-      </w:r>
-      <w:proofErr w:type="spellEnd"/>
-      <w:r>
-        <w:rPr>
-          <w:i/>
-          <w:color w:val="000000" w:themeColor="text1"/>
-        </w:rPr>
-        <w:t xml:space="preserve"> </w:t>
-      </w:r>
-      <w:proofErr w:type="spellStart"/>
-      <w:r>
-        <w:rPr>
-          <w:i/>
-          <w:color w:val="000000" w:themeColor="text1"/>
-        </w:rPr>
-        <w:t>Cryptography</w:t>
-      </w:r>
-      <w:proofErr w:type="spellEnd"/>
-      <w:r>
-        <w:rPr>
-          <w:i/>
-          <w:color w:val="000000" w:themeColor="text1"/>
-        </w:rPr>
-        <w:t xml:space="preserve">: </w:t>
-      </w:r>
-      <w:proofErr w:type="spellStart"/>
-      <w:r>
-        <w:rPr>
-          <w:i/>
-          <w:color w:val="000000" w:themeColor="text1"/>
-        </w:rPr>
-        <w:t>Protocols</w:t>
-      </w:r>
-      <w:proofErr w:type="spellEnd"/>
-      <w:r>
-        <w:rPr>
-          <w:i/>
-          <w:color w:val="000000" w:themeColor="text1"/>
-        </w:rPr>
-        <w:t xml:space="preserve">, </w:t>
-      </w:r>
-      <w:proofErr w:type="spellStart"/>
-      <w:r>
-        <w:rPr>
-          <w:i/>
-          <w:color w:val="000000" w:themeColor="text1"/>
-        </w:rPr>
-        <w:t>Algorithms</w:t>
-      </w:r>
-      <w:proofErr w:type="spellEnd"/>
-      <w:r>
-        <w:rPr>
-          <w:i/>
-          <w:color w:val="000000" w:themeColor="text1"/>
-        </w:rPr>
-        <w:t xml:space="preserve">, and </w:t>
-      </w:r>
-      <w:proofErr w:type="spellStart"/>
-      <w:r>
-        <w:rPr>
-          <w:i/>
-          <w:color w:val="000000" w:themeColor="text1"/>
-        </w:rPr>
-        <w:t>Source</w:t>
-      </w:r>
-      <w:proofErr w:type="spellEnd"/>
-      <w:r>
-        <w:rPr>
-          <w:i/>
-          <w:color w:val="000000" w:themeColor="text1"/>
-        </w:rPr>
-        <w:t xml:space="preserve"> Code in C</w:t>
-      </w:r>
-      <w:r>
-        <w:rPr>
-          <w:color w:val="000000" w:themeColor="text1"/>
-        </w:rPr>
-        <w:t>. 2da edición. John Wiley &amp; Sons, Nueva York, 1996. ISBN 978-0-471-11709-4.</w:t>
-      </w:r>
-    </w:p>
-    <w:p>
-      <w:pPr>
-        <w:pStyle w:val="Prrafodelista"/>
-        <w:numPr>
-          <w:ilvl w:val="0"/>
-          <w:numId w:val="14"/>
-        </w:numPr>
-        <w:spacing w:after="49"/>
-        <w:ind w:right="7"/>
-        <w:rPr>
-          <w:color w:val="000000" w:themeColor="text1"/>
-        </w:rPr>
-      </w:pPr>
-      <w:proofErr w:type="spellStart"/>
-      <w:r>
-        <w:rPr>
-          <w:color w:val="000000" w:themeColor="text1"/>
-        </w:rPr>
-        <w:t>National</w:t>
-      </w:r>
-      <w:proofErr w:type="spellEnd"/>
-      <w:r>
-        <w:rPr>
-          <w:color w:val="000000" w:themeColor="text1"/>
-        </w:rPr>
-        <w:t xml:space="preserve"> </w:t>
-      </w:r>
-      <w:proofErr w:type="spellStart"/>
-      <w:r>
-        <w:rPr>
-          <w:color w:val="000000" w:themeColor="text1"/>
-        </w:rPr>
-        <w:t>Institute</w:t>
-      </w:r>
-      <w:proofErr w:type="spellEnd"/>
-      <w:r>
-        <w:rPr>
-          <w:color w:val="000000" w:themeColor="text1"/>
-        </w:rPr>
-        <w:t xml:space="preserve"> </w:t>
-      </w:r>
-      <w:proofErr w:type="spellStart"/>
-      <w:r>
-        <w:rPr>
-          <w:color w:val="000000" w:themeColor="text1"/>
-        </w:rPr>
-        <w:t>of</w:t>
-      </w:r>
-      <w:proofErr w:type="spellEnd"/>
-      <w:r>
-        <w:rPr>
-          <w:color w:val="000000" w:themeColor="text1"/>
-        </w:rPr>
-        <w:t xml:space="preserve"> </w:t>
-      </w:r>
-      <w:proofErr w:type="spellStart"/>
-      <w:r>
-        <w:rPr>
-          <w:color w:val="000000" w:themeColor="text1"/>
-        </w:rPr>
-        <w:t>Standards</w:t>
-      </w:r>
-      <w:proofErr w:type="spellEnd"/>
-      <w:r>
-        <w:rPr>
-          <w:color w:val="000000" w:themeColor="text1"/>
-        </w:rPr>
-        <w:t xml:space="preserve"> and </w:t>
-      </w:r>
-      <w:proofErr w:type="spellStart"/>
-      <w:r>
-        <w:rPr>
-          <w:color w:val="000000" w:themeColor="text1"/>
-        </w:rPr>
-        <w:t>Technology</w:t>
-      </w:r>
-      <w:proofErr w:type="spellEnd"/>
-      <w:r>
-        <w:rPr>
-          <w:color w:val="000000" w:themeColor="text1"/>
-        </w:rPr>
+        </w:rPr>
+        <w:t>Corpus de referencia del español actual</w:t>
+      </w:r>
+      <w:r>
         <w:t xml:space="preserve">. </w:t>
       </w:r>
-      <w:proofErr w:type="spellStart"/>
-      <w:r>
-        <w:rPr>
-          <w:i/>
-          <w:color w:val="000000" w:themeColor="text1"/>
-        </w:rPr>
-        <w:t>Advanced</w:t>
-      </w:r>
-      <w:proofErr w:type="spellEnd"/>
-      <w:r>
-        <w:rPr>
-          <w:i/>
-          <w:color w:val="000000" w:themeColor="text1"/>
-        </w:rPr>
-        <w:t xml:space="preserve"> </w:t>
-      </w:r>
-      <w:proofErr w:type="spellStart"/>
-      <w:r>
-        <w:rPr>
-          <w:i/>
-          <w:color w:val="000000" w:themeColor="text1"/>
-        </w:rPr>
-        <w:t>Encryption</w:t>
-      </w:r>
-      <w:proofErr w:type="spellEnd"/>
-      <w:r>
-        <w:rPr>
-          <w:i/>
-          <w:color w:val="000000" w:themeColor="text1"/>
-        </w:rPr>
-        <w:t xml:space="preserve"> Standard (AES)</w:t>
-      </w:r>
-      <w:r>
-        <w:rPr>
-          <w:color w:val="000000" w:themeColor="text1"/>
-        </w:rPr>
-        <w:t xml:space="preserve">. FIPS PUB 197. U.S. </w:t>
-      </w:r>
-      <w:proofErr w:type="spellStart"/>
-      <w:r>
-        <w:rPr>
-          <w:color w:val="000000" w:themeColor="text1"/>
-        </w:rPr>
-        <w:t>Department</w:t>
-      </w:r>
-      <w:proofErr w:type="spellEnd"/>
-      <w:r>
-        <w:rPr>
-          <w:color w:val="000000" w:themeColor="text1"/>
-        </w:rPr>
-        <w:t xml:space="preserve"> </w:t>
-      </w:r>
-      <w:proofErr w:type="spellStart"/>
-      <w:r>
-        <w:rPr>
-          <w:color w:val="000000" w:themeColor="text1"/>
-        </w:rPr>
-        <w:t>of</w:t>
-      </w:r>
-      <w:proofErr w:type="spellEnd"/>
-      <w:r>
-        <w:rPr>
-          <w:color w:val="000000" w:themeColor="text1"/>
-        </w:rPr>
-        <w:t xml:space="preserve"> Commerce, 2001.</w:t>
-      </w:r>
-    </w:p>
-    <w:p>
-      <w:pPr>
-        <w:pStyle w:val="Prrafodelista"/>
-        <w:numPr>
-          <w:ilvl w:val="0"/>
-          <w:numId w:val="14"/>
-        </w:numPr>
-        <w:spacing w:after="68"/>
-        <w:ind w:right="7"/>
-        <w:rPr>
-          <w:color w:val="000000" w:themeColor="text1"/>
-        </w:rPr>
-      </w:pPr>
-      <w:r>
-        <w:rPr>
-          <w:color w:val="000000" w:themeColor="text1"/>
-        </w:rPr>
-        <w:t xml:space="preserve">Forristal, J. y Aggarwal, V. "A </w:t>
-      </w:r>
-      <w:proofErr w:type="spellStart"/>
-      <w:r>
-        <w:rPr>
-          <w:color w:val="000000" w:themeColor="text1"/>
-        </w:rPr>
-        <w:t>Survey</w:t>
-      </w:r>
-      <w:proofErr w:type="spellEnd"/>
-      <w:r>
-        <w:rPr>
-          <w:color w:val="000000" w:themeColor="text1"/>
-        </w:rPr>
-        <w:t xml:space="preserve"> </w:t>
-      </w:r>
-      <w:proofErr w:type="spellStart"/>
-      <w:r>
-        <w:rPr>
-          <w:color w:val="000000" w:themeColor="text1"/>
-        </w:rPr>
-        <w:t>of</w:t>
-      </w:r>
-      <w:proofErr w:type="spellEnd"/>
-      <w:r>
-        <w:rPr>
-          <w:color w:val="000000" w:themeColor="text1"/>
-        </w:rPr>
-        <w:t xml:space="preserve"> </w:t>
-      </w:r>
-      <w:proofErr w:type="spellStart"/>
-      <w:r>
-        <w:rPr>
-          <w:color w:val="000000" w:themeColor="text1"/>
-        </w:rPr>
-        <w:t>Cryptanalytic</w:t>
-      </w:r>
-      <w:proofErr w:type="spellEnd"/>
-      <w:r>
-        <w:rPr>
-          <w:color w:val="000000" w:themeColor="text1"/>
-        </w:rPr>
-        <w:t xml:space="preserve"> </w:t>
-      </w:r>
-      <w:proofErr w:type="spellStart"/>
-      <w:r>
-        <w:rPr>
-          <w:color w:val="000000" w:themeColor="text1"/>
-        </w:rPr>
-        <w:t>Methods</w:t>
-      </w:r>
-      <w:proofErr w:type="spellEnd"/>
-      <w:r>
-        <w:rPr>
-          <w:color w:val="000000" w:themeColor="text1"/>
-        </w:rPr>
-        <w:t xml:space="preserve"> </w:t>
-      </w:r>
-      <w:proofErr w:type="spellStart"/>
-      <w:r>
-        <w:rPr>
-          <w:color w:val="000000" w:themeColor="text1"/>
-        </w:rPr>
-        <w:t>for</w:t>
-      </w:r>
-      <w:proofErr w:type="spellEnd"/>
-      <w:r>
-        <w:rPr>
-          <w:color w:val="000000" w:themeColor="text1"/>
-        </w:rPr>
-        <w:t xml:space="preserve"> </w:t>
-      </w:r>
-      <w:proofErr w:type="spellStart"/>
-      <w:r>
-        <w:rPr>
-          <w:color w:val="000000" w:themeColor="text1"/>
-        </w:rPr>
-        <w:t>Classical</w:t>
-      </w:r>
-      <w:proofErr w:type="spellEnd"/>
-      <w:r>
-        <w:rPr>
-          <w:color w:val="000000" w:themeColor="text1"/>
-        </w:rPr>
-        <w:t xml:space="preserve"> </w:t>
-      </w:r>
-      <w:proofErr w:type="spellStart"/>
-      <w:r>
-        <w:rPr>
-          <w:color w:val="000000" w:themeColor="text1"/>
-        </w:rPr>
-        <w:t>Ciphers</w:t>
-      </w:r>
-      <w:proofErr w:type="spellEnd"/>
-      <w:r>
-        <w:rPr>
-          <w:color w:val="000000" w:themeColor="text1"/>
-        </w:rPr>
-        <w:t xml:space="preserve">." </w:t>
-      </w:r>
-      <w:r>
-        <w:rPr>
-          <w:i/>
-          <w:color w:val="000000" w:themeColor="text1"/>
-        </w:rPr>
-        <w:t xml:space="preserve">International </w:t>
-      </w:r>
-      <w:proofErr w:type="spellStart"/>
-      <w:r>
-        <w:rPr>
-          <w:i/>
-          <w:color w:val="000000" w:themeColor="text1"/>
-        </w:rPr>
-        <w:t>Journal</w:t>
-      </w:r>
-      <w:proofErr w:type="spellEnd"/>
-      <w:r>
-        <w:rPr>
-          <w:i/>
-          <w:color w:val="000000" w:themeColor="text1"/>
-        </w:rPr>
-        <w:t xml:space="preserve"> </w:t>
-      </w:r>
-      <w:proofErr w:type="spellStart"/>
-      <w:r>
-        <w:rPr>
-          <w:i/>
-          <w:color w:val="000000" w:themeColor="text1"/>
-        </w:rPr>
-        <w:t>of</w:t>
-      </w:r>
-      <w:proofErr w:type="spellEnd"/>
-      <w:r>
-        <w:rPr>
-          <w:i/>
-          <w:color w:val="000000" w:themeColor="text1"/>
-        </w:rPr>
-        <w:t xml:space="preserve"> </w:t>
-      </w:r>
-      <w:proofErr w:type="spellStart"/>
-      <w:r>
-        <w:rPr>
-          <w:i/>
-          <w:color w:val="000000" w:themeColor="text1"/>
-        </w:rPr>
-        <w:t>Computer</w:t>
-      </w:r>
-      <w:proofErr w:type="spellEnd"/>
-      <w:r>
-        <w:rPr>
-          <w:i/>
-          <w:color w:val="000000" w:themeColor="text1"/>
-        </w:rPr>
-        <w:t xml:space="preserve"> </w:t>
-      </w:r>
-      <w:proofErr w:type="spellStart"/>
-      <w:r>
-        <w:rPr>
-          <w:i/>
-          <w:color w:val="000000" w:themeColor="text1"/>
-        </w:rPr>
-        <w:t>Science</w:t>
-      </w:r>
-      <w:proofErr w:type="spellEnd"/>
-      <w:r>
-        <w:rPr>
-          <w:i/>
-          <w:color w:val="000000" w:themeColor="text1"/>
-        </w:rPr>
-        <w:t xml:space="preserve"> and </w:t>
-      </w:r>
-      <w:proofErr w:type="spellStart"/>
-      <w:r>
-        <w:rPr>
-          <w:i/>
-          <w:color w:val="000000" w:themeColor="text1"/>
-        </w:rPr>
-        <w:t>Information</w:t>
-      </w:r>
-      <w:proofErr w:type="spellEnd"/>
-      <w:r>
-        <w:rPr>
-          <w:i/>
-          <w:color w:val="000000" w:themeColor="text1"/>
-        </w:rPr>
-        <w:t xml:space="preserve"> Security</w:t>
-      </w:r>
-      <w:r>
-        <w:rPr>
-          <w:color w:val="000000" w:themeColor="text1"/>
-        </w:rPr>
-        <w:t>, vol. 9, no. 2, 2011.</w:t>
-      </w:r>
-    </w:p>
-    <w:p>
-      <w:pPr>
-        <w:spacing w:after="37" w:line="286" w:lineRule="auto"/>
-        <w:ind w:left="-5"/>
-        <w:jc w:val="left"/>
-        <w:rPr>
-          <w:color w:val="000000" w:themeColor="text1"/>
-        </w:rPr>
-      </w:pPr>
+      <w:hyperlink r:id="rId21">
+        <w:r>
+          <w:rPr>
+            <w:color w:val="0000FF"/>
+            <w:u w:val="single"/>
+          </w:rPr>
+          <w:t>https://corpus.rae.es/lfrecuencias.html</w:t>
+        </w:r>
+      </w:hyperlink>
+      <w:r>
+        <w:t xml:space="preserve"> — Corpus de referencia para las frecuencias del español usadas como datos de trabajo en script.js.</w:t>
+      </w:r>
     </w:p>
     <w:sectPr>
       <w:headerReference w:type="even" r:id="rId9"/>

</xml_diff>